<commit_message>
fix readme for day14 and day15
</commit_message>
<xml_diff>
--- a/week3/day14_and_15_Wednesday_Thursday/reports/Day14_15_MQTT_Broker_Technical_Report.docx
+++ b/week3/day14_and_15_Wednesday_Thursday/reports/Day14_15_MQTT_Broker_Technical_Report.docx
@@ -88,12 +88,6 @@
         <w:gridCol w:w="5600"/>
       </w:tblGrid>
       <w:tr>
-        <w:tblPrEx>
-          <w:tblCellMar>
-            <w:top w:w="0" w:type="dxa"/>
-            <w:bottom w:w="0" w:type="dxa"/>
-          </w:tblCellMar>
-        </w:tblPrEx>
         <w:trPr>
           <w:jc w:val="center"/>
         </w:trPr>
@@ -141,12 +135,6 @@
         </w:tc>
       </w:tr>
       <w:tr>
-        <w:tblPrEx>
-          <w:tblCellMar>
-            <w:top w:w="0" w:type="dxa"/>
-            <w:bottom w:w="0" w:type="dxa"/>
-          </w:tblCellMar>
-        </w:tblPrEx>
         <w:trPr>
           <w:jc w:val="center"/>
         </w:trPr>
@@ -197,12 +185,6 @@
         </w:tc>
       </w:tr>
       <w:tr>
-        <w:tblPrEx>
-          <w:tblCellMar>
-            <w:top w:w="0" w:type="dxa"/>
-            <w:bottom w:w="0" w:type="dxa"/>
-          </w:tblCellMar>
-        </w:tblPrEx>
         <w:trPr>
           <w:jc w:val="center"/>
         </w:trPr>
@@ -253,12 +235,6 @@
         </w:tc>
       </w:tr>
       <w:tr>
-        <w:tblPrEx>
-          <w:tblCellMar>
-            <w:top w:w="0" w:type="dxa"/>
-            <w:bottom w:w="0" w:type="dxa"/>
-          </w:tblCellMar>
-        </w:tblPrEx>
         <w:trPr>
           <w:jc w:val="center"/>
         </w:trPr>
@@ -317,12 +293,6 @@
         </w:tc>
       </w:tr>
       <w:tr>
-        <w:tblPrEx>
-          <w:tblCellMar>
-            <w:top w:w="0" w:type="dxa"/>
-            <w:bottom w:w="0" w:type="dxa"/>
-          </w:tblCellMar>
-        </w:tblPrEx>
         <w:trPr>
           <w:jc w:val="center"/>
         </w:trPr>
@@ -376,12 +346,6 @@
         </w:tc>
       </w:tr>
       <w:tr>
-        <w:tblPrEx>
-          <w:tblCellMar>
-            <w:top w:w="0" w:type="dxa"/>
-            <w:bottom w:w="0" w:type="dxa"/>
-          </w:tblCellMar>
-        </w:tblPrEx>
         <w:trPr>
           <w:jc w:val="center"/>
         </w:trPr>
@@ -453,444 +417,1950 @@
         </w:sectPr>
       </w:pPr>
     </w:p>
-    <w:p>
-      <w:pPr>
-        <w:pStyle w:val="Heading1"/>
-        <w:spacing w:before="360" w:after="200"/>
-      </w:pPr>
-      <w:r>
-        <w:rPr>
+    <w:sdt>
+      <w:sdtPr>
+        <w:rPr>
+          <w:lang w:val="en-GB"/>
+        </w:rPr>
+        <w:id w:val="336279701"/>
+        <w:docPartObj>
+          <w:docPartGallery w:val="Table of Contents"/>
+          <w:docPartUnique/>
+        </w:docPartObj>
+      </w:sdtPr>
+      <w:sdtEndPr>
+        <w:rPr>
+          <w:rFonts w:ascii="Times New Roman" w:eastAsia="Times New Roman" w:hAnsi="Times New Roman" w:cs="Times New Roman"/>
           <w:b/>
           <w:bCs/>
-        </w:rPr>
-        <w:lastRenderedPageBreak/>
-        <w:t>Contents</w:t>
-      </w:r>
-    </w:p>
-    <w:p>
-      <w:pPr>
-        <w:spacing w:after="90"/>
-      </w:pPr>
-      <w:r>
-        <w:rPr>
-          <w:b/>
-          <w:bCs/>
-          <w:color w:val="1F4D78"/>
-        </w:rPr>
-        <w:t>1. Daily Overview</w:t>
-      </w:r>
-    </w:p>
-    <w:p>
-      <w:pPr>
-        <w:spacing w:after="70"/>
-        <w:ind w:left="360"/>
-      </w:pPr>
-      <w:r>
-        <w:rPr>
-          <w:color w:val="333333"/>
-        </w:rPr>
-        <w:t>1.1 Summary</w:t>
-      </w:r>
-    </w:p>
-    <w:p>
-      <w:pPr>
-        <w:spacing w:after="70"/>
-        <w:ind w:left="360"/>
-      </w:pPr>
-      <w:r>
-        <w:rPr>
-          <w:color w:val="333333"/>
-        </w:rPr>
-        <w:t>1.2 Goal &amp; Submission Format</w:t>
-      </w:r>
-    </w:p>
-    <w:p>
-      <w:pPr>
-        <w:spacing w:after="70"/>
-        <w:ind w:left="360"/>
-      </w:pPr>
-      <w:r>
-        <w:rPr>
-          <w:color w:val="333333"/>
-        </w:rPr>
-        <w:t>1.3 Tasks Completed Today</w:t>
-      </w:r>
-    </w:p>
-    <w:p>
-      <w:pPr>
-        <w:spacing w:after="90"/>
-      </w:pPr>
-      <w:r>
-        <w:rPr>
-          <w:b/>
-          <w:bCs/>
-          <w:color w:val="1F4D78"/>
-        </w:rPr>
-        <w:t>2. Part 1 — Local Broker Setup on Windows</w:t>
-      </w:r>
-    </w:p>
-    <w:p>
-      <w:pPr>
-        <w:spacing w:after="70"/>
-        <w:ind w:left="360"/>
-      </w:pPr>
-      <w:r>
-        <w:rPr>
-          <w:color w:val="333333"/>
-        </w:rPr>
-        <w:t xml:space="preserve">2.1 Why the Default </w:t>
-      </w:r>
-      <w:proofErr w:type="spellStart"/>
-      <w:r>
-        <w:rPr>
-          <w:color w:val="333333"/>
-        </w:rPr>
-        <w:t>Mosquitto</w:t>
-      </w:r>
-      <w:proofErr w:type="spellEnd"/>
-      <w:r>
-        <w:rPr>
-          <w:color w:val="333333"/>
-        </w:rPr>
-        <w:t xml:space="preserve"> Install Fails Remote Devices</w:t>
-      </w:r>
-    </w:p>
-    <w:p>
-      <w:pPr>
-        <w:spacing w:after="70"/>
-        <w:ind w:left="360"/>
-      </w:pPr>
-      <w:r>
-        <w:rPr>
-          <w:color w:val="333333"/>
-        </w:rPr>
-        <w:t>2.2 Network Architecture — Windows + WSL 2 + ESP32</w:t>
-      </w:r>
-    </w:p>
-    <w:p>
-      <w:pPr>
-        <w:spacing w:after="70"/>
-        <w:ind w:left="360"/>
-      </w:pPr>
-      <w:r>
-        <w:rPr>
-          <w:color w:val="333333"/>
-        </w:rPr>
-        <w:t>2.3 Installation &amp; Port Conflict Resolution</w:t>
-      </w:r>
-    </w:p>
-    <w:p>
-      <w:pPr>
-        <w:spacing w:after="70"/>
-        <w:ind w:left="360"/>
-      </w:pPr>
-      <w:r>
-        <w:rPr>
-          <w:color w:val="333333"/>
-        </w:rPr>
-        <w:t xml:space="preserve">2.4 </w:t>
-      </w:r>
-      <w:proofErr w:type="spellStart"/>
-      <w:r>
-        <w:rPr>
-          <w:color w:val="333333"/>
-        </w:rPr>
-        <w:t>mosquitto.conf</w:t>
-      </w:r>
-      <w:proofErr w:type="spellEnd"/>
-      <w:r>
-        <w:rPr>
-          <w:color w:val="333333"/>
-        </w:rPr>
-        <w:t xml:space="preserve"> — Configuration &amp; Rationale</w:t>
-      </w:r>
-    </w:p>
-    <w:p>
-      <w:pPr>
-        <w:spacing w:after="70"/>
-        <w:ind w:left="360"/>
-      </w:pPr>
-      <w:r>
-        <w:rPr>
-          <w:color w:val="333333"/>
-        </w:rPr>
-        <w:t>2.5 Windows Firewall Rule</w:t>
-      </w:r>
-    </w:p>
-    <w:p>
-      <w:pPr>
-        <w:spacing w:after="70"/>
-        <w:ind w:left="360"/>
-      </w:pPr>
-      <w:r>
-        <w:rPr>
-          <w:color w:val="333333"/>
-        </w:rPr>
-        <w:t>2.6 WSL 2 NAT Boundary &amp; Port Proxy</w:t>
-      </w:r>
-    </w:p>
-    <w:p>
-      <w:pPr>
-        <w:spacing w:after="70"/>
-        <w:ind w:left="360"/>
-      </w:pPr>
-      <w:r>
-        <w:rPr>
-          <w:color w:val="333333"/>
-        </w:rPr>
-        <w:t xml:space="preserve">2.7 CLI Verification — </w:t>
-      </w:r>
-      <w:proofErr w:type="spellStart"/>
-      <w:r>
-        <w:rPr>
-          <w:color w:val="333333"/>
-        </w:rPr>
-        <w:t>mosquitto_pub</w:t>
-      </w:r>
-      <w:proofErr w:type="spellEnd"/>
-      <w:r>
-        <w:rPr>
-          <w:color w:val="333333"/>
-        </w:rPr>
-        <w:t xml:space="preserve"> / </w:t>
-      </w:r>
-      <w:proofErr w:type="spellStart"/>
-      <w:r>
-        <w:rPr>
-          <w:color w:val="333333"/>
-        </w:rPr>
-        <w:t>mosquitto_sub</w:t>
-      </w:r>
-      <w:proofErr w:type="spellEnd"/>
-    </w:p>
-    <w:p>
-      <w:pPr>
-        <w:spacing w:after="70"/>
-        <w:ind w:left="360"/>
-      </w:pPr>
-      <w:r>
-        <w:rPr>
-          <w:color w:val="333333"/>
-        </w:rPr>
-        <w:t>2.8 MQTT Explorer Setup</w:t>
-      </w:r>
-    </w:p>
-    <w:p>
-      <w:pPr>
-        <w:spacing w:after="90"/>
-      </w:pPr>
-      <w:r>
-        <w:rPr>
-          <w:b/>
-          <w:bCs/>
-          <w:color w:val="1F4D78"/>
-        </w:rPr>
-        <w:t>3. Part 2 — Topic Structure &amp; Namespace Design</w:t>
-      </w:r>
-    </w:p>
-    <w:p>
-      <w:pPr>
-        <w:spacing w:after="90"/>
-      </w:pPr>
-      <w:r>
-        <w:rPr>
-          <w:b/>
-          <w:bCs/>
-          <w:color w:val="1F4D78"/>
-        </w:rPr>
-        <w:t xml:space="preserve">4. Part 3 — Firmware Requirements &amp; Safety </w:t>
-      </w:r>
-      <w:proofErr w:type="spellStart"/>
-      <w:r>
-        <w:rPr>
-          <w:b/>
-          <w:bCs/>
-          <w:color w:val="1F4D78"/>
-        </w:rPr>
-        <w:t>Behaviour</w:t>
-      </w:r>
-      <w:proofErr w:type="spellEnd"/>
-    </w:p>
-    <w:p>
-      <w:pPr>
-        <w:spacing w:after="90"/>
-      </w:pPr>
-      <w:r>
-        <w:rPr>
-          <w:b/>
-          <w:bCs/>
-          <w:color w:val="1F4D78"/>
-        </w:rPr>
-        <w:t>5. Firmware Architecture</w:t>
-      </w:r>
-    </w:p>
-    <w:p>
-      <w:pPr>
-        <w:spacing w:after="70"/>
-        <w:ind w:left="360"/>
-      </w:pPr>
-      <w:r>
-        <w:rPr>
-          <w:color w:val="333333"/>
-        </w:rPr>
-        <w:t>5.1 L298N Motor Driver Class</w:t>
-      </w:r>
-    </w:p>
-    <w:p>
-      <w:pPr>
-        <w:spacing w:after="70"/>
-        <w:ind w:left="360"/>
-      </w:pPr>
-      <w:r>
-        <w:rPr>
-          <w:color w:val="333333"/>
-        </w:rPr>
-        <w:t>5.2 Main Application Flow (setup / loop)</w:t>
-      </w:r>
-    </w:p>
-    <w:p>
-      <w:pPr>
-        <w:spacing w:after="70"/>
-        <w:ind w:left="360"/>
-      </w:pPr>
-      <w:r>
-        <w:rPr>
-          <w:color w:val="333333"/>
-        </w:rPr>
-        <w:t xml:space="preserve">5.3 </w:t>
-      </w:r>
-      <w:proofErr w:type="spellStart"/>
-      <w:r>
-        <w:rPr>
-          <w:color w:val="333333"/>
-        </w:rPr>
-        <w:t>mqttCallback</w:t>
-      </w:r>
-      <w:proofErr w:type="spellEnd"/>
-      <w:r>
-        <w:rPr>
-          <w:color w:val="333333"/>
-        </w:rPr>
-        <w:t xml:space="preserve"> — Command Ingestion</w:t>
-      </w:r>
-    </w:p>
-    <w:p>
-      <w:pPr>
-        <w:spacing w:after="70"/>
-        <w:ind w:left="360"/>
-      </w:pPr>
-      <w:r>
-        <w:rPr>
-          <w:color w:val="333333"/>
-        </w:rPr>
-        <w:t xml:space="preserve">5.4 </w:t>
-      </w:r>
-      <w:proofErr w:type="spellStart"/>
-      <w:r>
-        <w:rPr>
-          <w:color w:val="333333"/>
-        </w:rPr>
-        <w:t>ensureConnections</w:t>
-      </w:r>
-      <w:proofErr w:type="spellEnd"/>
-      <w:r>
-        <w:rPr>
-          <w:color w:val="333333"/>
-        </w:rPr>
-        <w:t xml:space="preserve"> — Reconnect &amp; Failsafe</w:t>
-      </w:r>
-    </w:p>
-    <w:p>
-      <w:pPr>
-        <w:spacing w:after="70"/>
-        <w:ind w:left="360"/>
-      </w:pPr>
-      <w:r>
-        <w:rPr>
-          <w:color w:val="333333"/>
-        </w:rPr>
-        <w:t xml:space="preserve">5.5 </w:t>
-      </w:r>
-      <w:proofErr w:type="spellStart"/>
-      <w:r>
-        <w:rPr>
-          <w:color w:val="333333"/>
-        </w:rPr>
-        <w:t>applyMotorHardware</w:t>
-      </w:r>
-      <w:proofErr w:type="spellEnd"/>
-      <w:r>
-        <w:rPr>
-          <w:color w:val="333333"/>
-        </w:rPr>
-        <w:t xml:space="preserve"> — Failsafe Engine</w:t>
-      </w:r>
-    </w:p>
-    <w:p>
-      <w:pPr>
-        <w:spacing w:after="70"/>
-        <w:ind w:left="360"/>
-      </w:pPr>
-      <w:r>
-        <w:rPr>
-          <w:color w:val="333333"/>
-        </w:rPr>
-        <w:t xml:space="preserve">5.6 </w:t>
-      </w:r>
-      <w:proofErr w:type="spellStart"/>
-      <w:r>
-        <w:rPr>
-          <w:color w:val="333333"/>
-        </w:rPr>
-        <w:t>publishMotorStatus</w:t>
-      </w:r>
-      <w:proofErr w:type="spellEnd"/>
-      <w:r>
-        <w:rPr>
-          <w:color w:val="333333"/>
-        </w:rPr>
-        <w:t xml:space="preserve"> — True-State Reporter</w:t>
-      </w:r>
-    </w:p>
-    <w:p>
-      <w:pPr>
-        <w:spacing w:after="90"/>
-      </w:pPr>
-      <w:r>
-        <w:rPr>
-          <w:b/>
-          <w:bCs/>
-          <w:color w:val="1F4D78"/>
-        </w:rPr>
-        <w:t>6. End-to-End Verification &amp; Screenshots</w:t>
-      </w:r>
-    </w:p>
-    <w:p>
-      <w:pPr>
-        <w:spacing w:after="90"/>
-      </w:pPr>
-      <w:r>
-        <w:rPr>
-          <w:b/>
-          <w:bCs/>
-          <w:color w:val="1F4D78"/>
-        </w:rPr>
-        <w:t>7. Definition of Done</w:t>
-      </w:r>
-    </w:p>
-    <w:p>
-      <w:pPr>
-        <w:spacing w:after="90"/>
-      </w:pPr>
-      <w:r>
-        <w:rPr>
-          <w:b/>
-          <w:bCs/>
-          <w:color w:val="1F4D78"/>
-        </w:rPr>
-        <w:t>8. References</w:t>
-      </w:r>
-    </w:p>
+          <w:color w:val="auto"/>
+          <w:sz w:val="20"/>
+          <w:szCs w:val="20"/>
+        </w:rPr>
+      </w:sdtEndPr>
+      <w:sdtContent>
+        <w:p>
+          <w:pPr>
+            <w:pStyle w:val="TOCHeading"/>
+          </w:pPr>
+          <w:r>
+            <w:rPr>
+              <w:lang w:val="en-GB"/>
+            </w:rPr>
+            <w:t>Contents</w:t>
+          </w:r>
+        </w:p>
+        <w:p>
+          <w:pPr>
+            <w:pStyle w:val="TOC1"/>
+            <w:tabs>
+              <w:tab w:val="right" w:leader="dot" w:pos="9350"/>
+            </w:tabs>
+            <w:rPr>
+              <w:noProof/>
+            </w:rPr>
+          </w:pPr>
+          <w:r>
+            <w:fldChar w:fldCharType="begin"/>
+          </w:r>
+          <w:r>
+            <w:instrText xml:space="preserve"> TOC \o "1-3" \h \z \u </w:instrText>
+          </w:r>
+          <w:r>
+            <w:fldChar w:fldCharType="separate"/>
+          </w:r>
+          <w:hyperlink w:anchor="_Toc237764617" w:history="1">
+            <w:r>
+              <w:rPr>
+                <w:rStyle w:val="Hyperlink"/>
+                <w:b/>
+                <w:bCs/>
+                <w:noProof/>
+              </w:rPr>
+              <w:t>1. Daily Overview</w:t>
+            </w:r>
+            <w:r>
+              <w:rPr>
+                <w:noProof/>
+                <w:webHidden/>
+              </w:rPr>
+              <w:tab/>
+            </w:r>
+            <w:r>
+              <w:rPr>
+                <w:noProof/>
+                <w:webHidden/>
+              </w:rPr>
+              <w:fldChar w:fldCharType="begin"/>
+            </w:r>
+            <w:r>
+              <w:rPr>
+                <w:noProof/>
+                <w:webHidden/>
+              </w:rPr>
+              <w:instrText xml:space="preserve"> PAGEREF _Toc237764617 \h </w:instrText>
+            </w:r>
+            <w:r>
+              <w:rPr>
+                <w:noProof/>
+                <w:webHidden/>
+              </w:rPr>
+            </w:r>
+            <w:r>
+              <w:rPr>
+                <w:noProof/>
+                <w:webHidden/>
+              </w:rPr>
+              <w:fldChar w:fldCharType="separate"/>
+            </w:r>
+            <w:r>
+              <w:rPr>
+                <w:noProof/>
+                <w:webHidden/>
+              </w:rPr>
+              <w:t>3</w:t>
+            </w:r>
+            <w:r>
+              <w:rPr>
+                <w:noProof/>
+                <w:webHidden/>
+              </w:rPr>
+              <w:fldChar w:fldCharType="end"/>
+            </w:r>
+          </w:hyperlink>
+        </w:p>
+        <w:p>
+          <w:pPr>
+            <w:pStyle w:val="TOC2"/>
+            <w:tabs>
+              <w:tab w:val="right" w:leader="dot" w:pos="9350"/>
+            </w:tabs>
+            <w:rPr>
+              <w:noProof/>
+            </w:rPr>
+          </w:pPr>
+          <w:hyperlink w:anchor="_Toc237764618" w:history="1">
+            <w:r>
+              <w:rPr>
+                <w:rStyle w:val="Hyperlink"/>
+                <w:b/>
+                <w:bCs/>
+                <w:noProof/>
+              </w:rPr>
+              <w:t>1.1 Summary</w:t>
+            </w:r>
+            <w:r>
+              <w:rPr>
+                <w:noProof/>
+                <w:webHidden/>
+              </w:rPr>
+              <w:tab/>
+            </w:r>
+            <w:r>
+              <w:rPr>
+                <w:noProof/>
+                <w:webHidden/>
+              </w:rPr>
+              <w:fldChar w:fldCharType="begin"/>
+            </w:r>
+            <w:r>
+              <w:rPr>
+                <w:noProof/>
+                <w:webHidden/>
+              </w:rPr>
+              <w:instrText xml:space="preserve"> PAGEREF _Toc237764618 \h </w:instrText>
+            </w:r>
+            <w:r>
+              <w:rPr>
+                <w:noProof/>
+                <w:webHidden/>
+              </w:rPr>
+            </w:r>
+            <w:r>
+              <w:rPr>
+                <w:noProof/>
+                <w:webHidden/>
+              </w:rPr>
+              <w:fldChar w:fldCharType="separate"/>
+            </w:r>
+            <w:r>
+              <w:rPr>
+                <w:noProof/>
+                <w:webHidden/>
+              </w:rPr>
+              <w:t>3</w:t>
+            </w:r>
+            <w:r>
+              <w:rPr>
+                <w:noProof/>
+                <w:webHidden/>
+              </w:rPr>
+              <w:fldChar w:fldCharType="end"/>
+            </w:r>
+          </w:hyperlink>
+        </w:p>
+        <w:p>
+          <w:pPr>
+            <w:pStyle w:val="TOC2"/>
+            <w:tabs>
+              <w:tab w:val="right" w:leader="dot" w:pos="9350"/>
+            </w:tabs>
+            <w:rPr>
+              <w:noProof/>
+            </w:rPr>
+          </w:pPr>
+          <w:hyperlink w:anchor="_Toc237764619" w:history="1">
+            <w:r>
+              <w:rPr>
+                <w:rStyle w:val="Hyperlink"/>
+                <w:b/>
+                <w:bCs/>
+                <w:noProof/>
+              </w:rPr>
+              <w:t>1.2 Goal &amp; Submission Format</w:t>
+            </w:r>
+            <w:r>
+              <w:rPr>
+                <w:noProof/>
+                <w:webHidden/>
+              </w:rPr>
+              <w:tab/>
+            </w:r>
+            <w:r>
+              <w:rPr>
+                <w:noProof/>
+                <w:webHidden/>
+              </w:rPr>
+              <w:fldChar w:fldCharType="begin"/>
+            </w:r>
+            <w:r>
+              <w:rPr>
+                <w:noProof/>
+                <w:webHidden/>
+              </w:rPr>
+              <w:instrText xml:space="preserve"> PAGEREF _Toc237764619 \h </w:instrText>
+            </w:r>
+            <w:r>
+              <w:rPr>
+                <w:noProof/>
+                <w:webHidden/>
+              </w:rPr>
+            </w:r>
+            <w:r>
+              <w:rPr>
+                <w:noProof/>
+                <w:webHidden/>
+              </w:rPr>
+              <w:fldChar w:fldCharType="separate"/>
+            </w:r>
+            <w:r>
+              <w:rPr>
+                <w:noProof/>
+                <w:webHidden/>
+              </w:rPr>
+              <w:t>3</w:t>
+            </w:r>
+            <w:r>
+              <w:rPr>
+                <w:noProof/>
+                <w:webHidden/>
+              </w:rPr>
+              <w:fldChar w:fldCharType="end"/>
+            </w:r>
+          </w:hyperlink>
+        </w:p>
+        <w:p>
+          <w:pPr>
+            <w:pStyle w:val="TOC2"/>
+            <w:tabs>
+              <w:tab w:val="right" w:leader="dot" w:pos="9350"/>
+            </w:tabs>
+            <w:rPr>
+              <w:noProof/>
+            </w:rPr>
+          </w:pPr>
+          <w:hyperlink w:anchor="_Toc237764620" w:history="1">
+            <w:r>
+              <w:rPr>
+                <w:rStyle w:val="Hyperlink"/>
+                <w:b/>
+                <w:bCs/>
+                <w:noProof/>
+              </w:rPr>
+              <w:t>1.3 Tasks Completed Today</w:t>
+            </w:r>
+            <w:r>
+              <w:rPr>
+                <w:noProof/>
+                <w:webHidden/>
+              </w:rPr>
+              <w:tab/>
+            </w:r>
+            <w:r>
+              <w:rPr>
+                <w:noProof/>
+                <w:webHidden/>
+              </w:rPr>
+              <w:fldChar w:fldCharType="begin"/>
+            </w:r>
+            <w:r>
+              <w:rPr>
+                <w:noProof/>
+                <w:webHidden/>
+              </w:rPr>
+              <w:instrText xml:space="preserve"> PAGEREF _Toc237764620 \h </w:instrText>
+            </w:r>
+            <w:r>
+              <w:rPr>
+                <w:noProof/>
+                <w:webHidden/>
+              </w:rPr>
+            </w:r>
+            <w:r>
+              <w:rPr>
+                <w:noProof/>
+                <w:webHidden/>
+              </w:rPr>
+              <w:fldChar w:fldCharType="separate"/>
+            </w:r>
+            <w:r>
+              <w:rPr>
+                <w:noProof/>
+                <w:webHidden/>
+              </w:rPr>
+              <w:t>3</w:t>
+            </w:r>
+            <w:r>
+              <w:rPr>
+                <w:noProof/>
+                <w:webHidden/>
+              </w:rPr>
+              <w:fldChar w:fldCharType="end"/>
+            </w:r>
+          </w:hyperlink>
+        </w:p>
+        <w:p>
+          <w:pPr>
+            <w:pStyle w:val="TOC1"/>
+            <w:tabs>
+              <w:tab w:val="right" w:leader="dot" w:pos="9350"/>
+            </w:tabs>
+            <w:rPr>
+              <w:noProof/>
+            </w:rPr>
+          </w:pPr>
+          <w:hyperlink w:anchor="_Toc237764621" w:history="1">
+            <w:r>
+              <w:rPr>
+                <w:rStyle w:val="Hyperlink"/>
+                <w:b/>
+                <w:bCs/>
+                <w:noProof/>
+              </w:rPr>
+              <w:t>2. Part 1 — Local Broker Setup on Windows</w:t>
+            </w:r>
+            <w:r>
+              <w:rPr>
+                <w:noProof/>
+                <w:webHidden/>
+              </w:rPr>
+              <w:tab/>
+            </w:r>
+            <w:r>
+              <w:rPr>
+                <w:noProof/>
+                <w:webHidden/>
+              </w:rPr>
+              <w:fldChar w:fldCharType="begin"/>
+            </w:r>
+            <w:r>
+              <w:rPr>
+                <w:noProof/>
+                <w:webHidden/>
+              </w:rPr>
+              <w:instrText xml:space="preserve"> PAGEREF _Toc237764621 \h </w:instrText>
+            </w:r>
+            <w:r>
+              <w:rPr>
+                <w:noProof/>
+                <w:webHidden/>
+              </w:rPr>
+            </w:r>
+            <w:r>
+              <w:rPr>
+                <w:noProof/>
+                <w:webHidden/>
+              </w:rPr>
+              <w:fldChar w:fldCharType="separate"/>
+            </w:r>
+            <w:r>
+              <w:rPr>
+                <w:noProof/>
+                <w:webHidden/>
+              </w:rPr>
+              <w:t>5</w:t>
+            </w:r>
+            <w:r>
+              <w:rPr>
+                <w:noProof/>
+                <w:webHidden/>
+              </w:rPr>
+              <w:fldChar w:fldCharType="end"/>
+            </w:r>
+          </w:hyperlink>
+        </w:p>
+        <w:p>
+          <w:pPr>
+            <w:pStyle w:val="TOC2"/>
+            <w:tabs>
+              <w:tab w:val="right" w:leader="dot" w:pos="9350"/>
+            </w:tabs>
+            <w:rPr>
+              <w:noProof/>
+            </w:rPr>
+          </w:pPr>
+          <w:hyperlink w:anchor="_Toc237764622" w:history="1">
+            <w:r>
+              <w:rPr>
+                <w:rStyle w:val="Hyperlink"/>
+                <w:b/>
+                <w:bCs/>
+                <w:noProof/>
+              </w:rPr>
+              <w:t>2.1 Why the Default Mosquitto Install Fails Remote Devices</w:t>
+            </w:r>
+            <w:r>
+              <w:rPr>
+                <w:noProof/>
+                <w:webHidden/>
+              </w:rPr>
+              <w:tab/>
+            </w:r>
+            <w:r>
+              <w:rPr>
+                <w:noProof/>
+                <w:webHidden/>
+              </w:rPr>
+              <w:fldChar w:fldCharType="begin"/>
+            </w:r>
+            <w:r>
+              <w:rPr>
+                <w:noProof/>
+                <w:webHidden/>
+              </w:rPr>
+              <w:instrText xml:space="preserve"> PAGEREF _Toc237764622 \h </w:instrText>
+            </w:r>
+            <w:r>
+              <w:rPr>
+                <w:noProof/>
+                <w:webHidden/>
+              </w:rPr>
+            </w:r>
+            <w:r>
+              <w:rPr>
+                <w:noProof/>
+                <w:webHidden/>
+              </w:rPr>
+              <w:fldChar w:fldCharType="separate"/>
+            </w:r>
+            <w:r>
+              <w:rPr>
+                <w:noProof/>
+                <w:webHidden/>
+              </w:rPr>
+              <w:t>5</w:t>
+            </w:r>
+            <w:r>
+              <w:rPr>
+                <w:noProof/>
+                <w:webHidden/>
+              </w:rPr>
+              <w:fldChar w:fldCharType="end"/>
+            </w:r>
+          </w:hyperlink>
+        </w:p>
+        <w:p>
+          <w:pPr>
+            <w:pStyle w:val="TOC2"/>
+            <w:tabs>
+              <w:tab w:val="right" w:leader="dot" w:pos="9350"/>
+            </w:tabs>
+            <w:rPr>
+              <w:noProof/>
+            </w:rPr>
+          </w:pPr>
+          <w:hyperlink w:anchor="_Toc237764623" w:history="1">
+            <w:r>
+              <w:rPr>
+                <w:rStyle w:val="Hyperlink"/>
+                <w:b/>
+                <w:bCs/>
+                <w:noProof/>
+              </w:rPr>
+              <w:t>2.2 Network Architecture — Windows + WSL 2 + ESP32</w:t>
+            </w:r>
+            <w:r>
+              <w:rPr>
+                <w:noProof/>
+                <w:webHidden/>
+              </w:rPr>
+              <w:tab/>
+            </w:r>
+            <w:r>
+              <w:rPr>
+                <w:noProof/>
+                <w:webHidden/>
+              </w:rPr>
+              <w:fldChar w:fldCharType="begin"/>
+            </w:r>
+            <w:r>
+              <w:rPr>
+                <w:noProof/>
+                <w:webHidden/>
+              </w:rPr>
+              <w:instrText xml:space="preserve"> PAGEREF _Toc237764623 \h </w:instrText>
+            </w:r>
+            <w:r>
+              <w:rPr>
+                <w:noProof/>
+                <w:webHidden/>
+              </w:rPr>
+            </w:r>
+            <w:r>
+              <w:rPr>
+                <w:noProof/>
+                <w:webHidden/>
+              </w:rPr>
+              <w:fldChar w:fldCharType="separate"/>
+            </w:r>
+            <w:r>
+              <w:rPr>
+                <w:noProof/>
+                <w:webHidden/>
+              </w:rPr>
+              <w:t>5</w:t>
+            </w:r>
+            <w:r>
+              <w:rPr>
+                <w:noProof/>
+                <w:webHidden/>
+              </w:rPr>
+              <w:fldChar w:fldCharType="end"/>
+            </w:r>
+          </w:hyperlink>
+        </w:p>
+        <w:p>
+          <w:pPr>
+            <w:pStyle w:val="TOC3"/>
+            <w:tabs>
+              <w:tab w:val="right" w:leader="dot" w:pos="9350"/>
+            </w:tabs>
+            <w:rPr>
+              <w:noProof/>
+            </w:rPr>
+          </w:pPr>
+          <w:hyperlink w:anchor="_Toc237764624" w:history="1">
+            <w:r>
+              <w:rPr>
+                <w:rStyle w:val="Hyperlink"/>
+                <w:b/>
+                <w:bCs/>
+                <w:noProof/>
+              </w:rPr>
+              <w:t>Key Technical Concepts</w:t>
+            </w:r>
+            <w:r>
+              <w:rPr>
+                <w:noProof/>
+                <w:webHidden/>
+              </w:rPr>
+              <w:tab/>
+            </w:r>
+            <w:r>
+              <w:rPr>
+                <w:noProof/>
+                <w:webHidden/>
+              </w:rPr>
+              <w:fldChar w:fldCharType="begin"/>
+            </w:r>
+            <w:r>
+              <w:rPr>
+                <w:noProof/>
+                <w:webHidden/>
+              </w:rPr>
+              <w:instrText xml:space="preserve"> PAGEREF _Toc237764624 \h </w:instrText>
+            </w:r>
+            <w:r>
+              <w:rPr>
+                <w:noProof/>
+                <w:webHidden/>
+              </w:rPr>
+            </w:r>
+            <w:r>
+              <w:rPr>
+                <w:noProof/>
+                <w:webHidden/>
+              </w:rPr>
+              <w:fldChar w:fldCharType="separate"/>
+            </w:r>
+            <w:r>
+              <w:rPr>
+                <w:noProof/>
+                <w:webHidden/>
+              </w:rPr>
+              <w:t>5</w:t>
+            </w:r>
+            <w:r>
+              <w:rPr>
+                <w:noProof/>
+                <w:webHidden/>
+              </w:rPr>
+              <w:fldChar w:fldCharType="end"/>
+            </w:r>
+          </w:hyperlink>
+        </w:p>
+        <w:p>
+          <w:pPr>
+            <w:pStyle w:val="TOC2"/>
+            <w:tabs>
+              <w:tab w:val="right" w:leader="dot" w:pos="9350"/>
+            </w:tabs>
+            <w:rPr>
+              <w:noProof/>
+            </w:rPr>
+          </w:pPr>
+          <w:hyperlink w:anchor="_Toc237764625" w:history="1">
+            <w:r>
+              <w:rPr>
+                <w:rStyle w:val="Hyperlink"/>
+                <w:b/>
+                <w:bCs/>
+                <w:noProof/>
+              </w:rPr>
+              <w:t>2.3 Installation &amp; Port Conflict Resolution</w:t>
+            </w:r>
+            <w:r>
+              <w:rPr>
+                <w:noProof/>
+                <w:webHidden/>
+              </w:rPr>
+              <w:tab/>
+            </w:r>
+            <w:r>
+              <w:rPr>
+                <w:noProof/>
+                <w:webHidden/>
+              </w:rPr>
+              <w:fldChar w:fldCharType="begin"/>
+            </w:r>
+            <w:r>
+              <w:rPr>
+                <w:noProof/>
+                <w:webHidden/>
+              </w:rPr>
+              <w:instrText xml:space="preserve"> PAGEREF _Toc237764625 \h </w:instrText>
+            </w:r>
+            <w:r>
+              <w:rPr>
+                <w:noProof/>
+                <w:webHidden/>
+              </w:rPr>
+            </w:r>
+            <w:r>
+              <w:rPr>
+                <w:noProof/>
+                <w:webHidden/>
+              </w:rPr>
+              <w:fldChar w:fldCharType="separate"/>
+            </w:r>
+            <w:r>
+              <w:rPr>
+                <w:noProof/>
+                <w:webHidden/>
+              </w:rPr>
+              <w:t>5</w:t>
+            </w:r>
+            <w:r>
+              <w:rPr>
+                <w:noProof/>
+                <w:webHidden/>
+              </w:rPr>
+              <w:fldChar w:fldCharType="end"/>
+            </w:r>
+          </w:hyperlink>
+        </w:p>
+        <w:p>
+          <w:pPr>
+            <w:pStyle w:val="TOC2"/>
+            <w:tabs>
+              <w:tab w:val="right" w:leader="dot" w:pos="9350"/>
+            </w:tabs>
+            <w:rPr>
+              <w:noProof/>
+            </w:rPr>
+          </w:pPr>
+          <w:hyperlink w:anchor="_Toc237764626" w:history="1">
+            <w:r>
+              <w:rPr>
+                <w:rStyle w:val="Hyperlink"/>
+                <w:b/>
+                <w:bCs/>
+                <w:noProof/>
+              </w:rPr>
+              <w:t>2.4 mosquitto.conf — Configuration &amp; Rationale</w:t>
+            </w:r>
+            <w:r>
+              <w:rPr>
+                <w:noProof/>
+                <w:webHidden/>
+              </w:rPr>
+              <w:tab/>
+            </w:r>
+            <w:r>
+              <w:rPr>
+                <w:noProof/>
+                <w:webHidden/>
+              </w:rPr>
+              <w:fldChar w:fldCharType="begin"/>
+            </w:r>
+            <w:r>
+              <w:rPr>
+                <w:noProof/>
+                <w:webHidden/>
+              </w:rPr>
+              <w:instrText xml:space="preserve"> PAGEREF _Toc237764626 \h </w:instrText>
+            </w:r>
+            <w:r>
+              <w:rPr>
+                <w:noProof/>
+                <w:webHidden/>
+              </w:rPr>
+            </w:r>
+            <w:r>
+              <w:rPr>
+                <w:noProof/>
+                <w:webHidden/>
+              </w:rPr>
+              <w:fldChar w:fldCharType="separate"/>
+            </w:r>
+            <w:r>
+              <w:rPr>
+                <w:noProof/>
+                <w:webHidden/>
+              </w:rPr>
+              <w:t>6</w:t>
+            </w:r>
+            <w:r>
+              <w:rPr>
+                <w:noProof/>
+                <w:webHidden/>
+              </w:rPr>
+              <w:fldChar w:fldCharType="end"/>
+            </w:r>
+          </w:hyperlink>
+        </w:p>
+        <w:p>
+          <w:pPr>
+            <w:pStyle w:val="TOC2"/>
+            <w:tabs>
+              <w:tab w:val="right" w:leader="dot" w:pos="9350"/>
+            </w:tabs>
+            <w:rPr>
+              <w:noProof/>
+            </w:rPr>
+          </w:pPr>
+          <w:hyperlink w:anchor="_Toc237764627" w:history="1">
+            <w:r>
+              <w:rPr>
+                <w:rStyle w:val="Hyperlink"/>
+                <w:b/>
+                <w:bCs/>
+                <w:noProof/>
+              </w:rPr>
+              <w:t>2.5 Windows Firewall Rule</w:t>
+            </w:r>
+            <w:r>
+              <w:rPr>
+                <w:noProof/>
+                <w:webHidden/>
+              </w:rPr>
+              <w:tab/>
+            </w:r>
+            <w:r>
+              <w:rPr>
+                <w:noProof/>
+                <w:webHidden/>
+              </w:rPr>
+              <w:fldChar w:fldCharType="begin"/>
+            </w:r>
+            <w:r>
+              <w:rPr>
+                <w:noProof/>
+                <w:webHidden/>
+              </w:rPr>
+              <w:instrText xml:space="preserve"> PAGEREF _Toc237764627 \h </w:instrText>
+            </w:r>
+            <w:r>
+              <w:rPr>
+                <w:noProof/>
+                <w:webHidden/>
+              </w:rPr>
+            </w:r>
+            <w:r>
+              <w:rPr>
+                <w:noProof/>
+                <w:webHidden/>
+              </w:rPr>
+              <w:fldChar w:fldCharType="separate"/>
+            </w:r>
+            <w:r>
+              <w:rPr>
+                <w:noProof/>
+                <w:webHidden/>
+              </w:rPr>
+              <w:t>6</w:t>
+            </w:r>
+            <w:r>
+              <w:rPr>
+                <w:noProof/>
+                <w:webHidden/>
+              </w:rPr>
+              <w:fldChar w:fldCharType="end"/>
+            </w:r>
+          </w:hyperlink>
+        </w:p>
+        <w:p>
+          <w:pPr>
+            <w:pStyle w:val="TOC2"/>
+            <w:tabs>
+              <w:tab w:val="right" w:leader="dot" w:pos="9350"/>
+            </w:tabs>
+            <w:rPr>
+              <w:noProof/>
+            </w:rPr>
+          </w:pPr>
+          <w:hyperlink w:anchor="_Toc237764628" w:history="1">
+            <w:r>
+              <w:rPr>
+                <w:rStyle w:val="Hyperlink"/>
+                <w:b/>
+                <w:bCs/>
+                <w:noProof/>
+              </w:rPr>
+              <w:t>2.6 WSL 2 NAT Boundary &amp; Port Proxy</w:t>
+            </w:r>
+            <w:r>
+              <w:rPr>
+                <w:noProof/>
+                <w:webHidden/>
+              </w:rPr>
+              <w:tab/>
+            </w:r>
+            <w:r>
+              <w:rPr>
+                <w:noProof/>
+                <w:webHidden/>
+              </w:rPr>
+              <w:fldChar w:fldCharType="begin"/>
+            </w:r>
+            <w:r>
+              <w:rPr>
+                <w:noProof/>
+                <w:webHidden/>
+              </w:rPr>
+              <w:instrText xml:space="preserve"> PAGEREF _Toc237764628 \h </w:instrText>
+            </w:r>
+            <w:r>
+              <w:rPr>
+                <w:noProof/>
+                <w:webHidden/>
+              </w:rPr>
+            </w:r>
+            <w:r>
+              <w:rPr>
+                <w:noProof/>
+                <w:webHidden/>
+              </w:rPr>
+              <w:fldChar w:fldCharType="separate"/>
+            </w:r>
+            <w:r>
+              <w:rPr>
+                <w:noProof/>
+                <w:webHidden/>
+              </w:rPr>
+              <w:t>7</w:t>
+            </w:r>
+            <w:r>
+              <w:rPr>
+                <w:noProof/>
+                <w:webHidden/>
+              </w:rPr>
+              <w:fldChar w:fldCharType="end"/>
+            </w:r>
+          </w:hyperlink>
+        </w:p>
+        <w:p>
+          <w:pPr>
+            <w:pStyle w:val="TOC2"/>
+            <w:tabs>
+              <w:tab w:val="right" w:leader="dot" w:pos="9350"/>
+            </w:tabs>
+            <w:rPr>
+              <w:noProof/>
+            </w:rPr>
+          </w:pPr>
+          <w:hyperlink w:anchor="_Toc237764629" w:history="1">
+            <w:r>
+              <w:rPr>
+                <w:rStyle w:val="Hyperlink"/>
+                <w:b/>
+                <w:bCs/>
+                <w:noProof/>
+              </w:rPr>
+              <w:t>2.7 CLI Verification — mosquitto_pub / mosquitto_sub</w:t>
+            </w:r>
+            <w:r>
+              <w:rPr>
+                <w:noProof/>
+                <w:webHidden/>
+              </w:rPr>
+              <w:tab/>
+            </w:r>
+            <w:r>
+              <w:rPr>
+                <w:noProof/>
+                <w:webHidden/>
+              </w:rPr>
+              <w:fldChar w:fldCharType="begin"/>
+            </w:r>
+            <w:r>
+              <w:rPr>
+                <w:noProof/>
+                <w:webHidden/>
+              </w:rPr>
+              <w:instrText xml:space="preserve"> PAGEREF _Toc237764629 \h </w:instrText>
+            </w:r>
+            <w:r>
+              <w:rPr>
+                <w:noProof/>
+                <w:webHidden/>
+              </w:rPr>
+            </w:r>
+            <w:r>
+              <w:rPr>
+                <w:noProof/>
+                <w:webHidden/>
+              </w:rPr>
+              <w:fldChar w:fldCharType="separate"/>
+            </w:r>
+            <w:r>
+              <w:rPr>
+                <w:noProof/>
+                <w:webHidden/>
+              </w:rPr>
+              <w:t>8</w:t>
+            </w:r>
+            <w:r>
+              <w:rPr>
+                <w:noProof/>
+                <w:webHidden/>
+              </w:rPr>
+              <w:fldChar w:fldCharType="end"/>
+            </w:r>
+          </w:hyperlink>
+        </w:p>
+        <w:p>
+          <w:pPr>
+            <w:pStyle w:val="TOC2"/>
+            <w:tabs>
+              <w:tab w:val="right" w:leader="dot" w:pos="9350"/>
+            </w:tabs>
+            <w:rPr>
+              <w:noProof/>
+            </w:rPr>
+          </w:pPr>
+          <w:hyperlink w:anchor="_Toc237764630" w:history="1">
+            <w:r>
+              <w:rPr>
+                <w:rStyle w:val="Hyperlink"/>
+                <w:b/>
+                <w:bCs/>
+                <w:noProof/>
+              </w:rPr>
+              <w:t>2.8 MQTT Explorer Setup</w:t>
+            </w:r>
+            <w:r>
+              <w:rPr>
+                <w:noProof/>
+                <w:webHidden/>
+              </w:rPr>
+              <w:tab/>
+            </w:r>
+            <w:r>
+              <w:rPr>
+                <w:noProof/>
+                <w:webHidden/>
+              </w:rPr>
+              <w:fldChar w:fldCharType="begin"/>
+            </w:r>
+            <w:r>
+              <w:rPr>
+                <w:noProof/>
+                <w:webHidden/>
+              </w:rPr>
+              <w:instrText xml:space="preserve"> PAGEREF _Toc237764630 \h </w:instrText>
+            </w:r>
+            <w:r>
+              <w:rPr>
+                <w:noProof/>
+                <w:webHidden/>
+              </w:rPr>
+            </w:r>
+            <w:r>
+              <w:rPr>
+                <w:noProof/>
+                <w:webHidden/>
+              </w:rPr>
+              <w:fldChar w:fldCharType="separate"/>
+            </w:r>
+            <w:r>
+              <w:rPr>
+                <w:noProof/>
+                <w:webHidden/>
+              </w:rPr>
+              <w:t>9</w:t>
+            </w:r>
+            <w:r>
+              <w:rPr>
+                <w:noProof/>
+                <w:webHidden/>
+              </w:rPr>
+              <w:fldChar w:fldCharType="end"/>
+            </w:r>
+          </w:hyperlink>
+        </w:p>
+        <w:p>
+          <w:pPr>
+            <w:pStyle w:val="TOC1"/>
+            <w:tabs>
+              <w:tab w:val="right" w:leader="dot" w:pos="9350"/>
+            </w:tabs>
+            <w:rPr>
+              <w:noProof/>
+            </w:rPr>
+          </w:pPr>
+          <w:hyperlink w:anchor="_Toc237764631" w:history="1">
+            <w:r>
+              <w:rPr>
+                <w:rStyle w:val="Hyperlink"/>
+                <w:b/>
+                <w:bCs/>
+                <w:noProof/>
+              </w:rPr>
+              <w:t>3. Part 2 — Topic Structure &amp; Namespace Design</w:t>
+            </w:r>
+            <w:r>
+              <w:rPr>
+                <w:noProof/>
+                <w:webHidden/>
+              </w:rPr>
+              <w:tab/>
+            </w:r>
+            <w:r>
+              <w:rPr>
+                <w:noProof/>
+                <w:webHidden/>
+              </w:rPr>
+              <w:fldChar w:fldCharType="begin"/>
+            </w:r>
+            <w:r>
+              <w:rPr>
+                <w:noProof/>
+                <w:webHidden/>
+              </w:rPr>
+              <w:instrText xml:space="preserve"> PAGEREF _Toc237764631 \h </w:instrText>
+            </w:r>
+            <w:r>
+              <w:rPr>
+                <w:noProof/>
+                <w:webHidden/>
+              </w:rPr>
+            </w:r>
+            <w:r>
+              <w:rPr>
+                <w:noProof/>
+                <w:webHidden/>
+              </w:rPr>
+              <w:fldChar w:fldCharType="separate"/>
+            </w:r>
+            <w:r>
+              <w:rPr>
+                <w:noProof/>
+                <w:webHidden/>
+              </w:rPr>
+              <w:t>10</w:t>
+            </w:r>
+            <w:r>
+              <w:rPr>
+                <w:noProof/>
+                <w:webHidden/>
+              </w:rPr>
+              <w:fldChar w:fldCharType="end"/>
+            </w:r>
+          </w:hyperlink>
+        </w:p>
+        <w:p>
+          <w:pPr>
+            <w:pStyle w:val="TOC3"/>
+            <w:tabs>
+              <w:tab w:val="right" w:leader="dot" w:pos="9350"/>
+            </w:tabs>
+            <w:rPr>
+              <w:noProof/>
+            </w:rPr>
+          </w:pPr>
+          <w:hyperlink w:anchor="_Toc237764632" w:history="1">
+            <w:r>
+              <w:rPr>
+                <w:rStyle w:val="Hyperlink"/>
+                <w:b/>
+                <w:bCs/>
+                <w:noProof/>
+              </w:rPr>
+              <w:t>Publish — ESP32 → Broker (Telemetry &amp; True State)</w:t>
+            </w:r>
+            <w:r>
+              <w:rPr>
+                <w:noProof/>
+                <w:webHidden/>
+              </w:rPr>
+              <w:tab/>
+            </w:r>
+            <w:r>
+              <w:rPr>
+                <w:noProof/>
+                <w:webHidden/>
+              </w:rPr>
+              <w:fldChar w:fldCharType="begin"/>
+            </w:r>
+            <w:r>
+              <w:rPr>
+                <w:noProof/>
+                <w:webHidden/>
+              </w:rPr>
+              <w:instrText xml:space="preserve"> PAGEREF _Toc237764632 \h </w:instrText>
+            </w:r>
+            <w:r>
+              <w:rPr>
+                <w:noProof/>
+                <w:webHidden/>
+              </w:rPr>
+            </w:r>
+            <w:r>
+              <w:rPr>
+                <w:noProof/>
+                <w:webHidden/>
+              </w:rPr>
+              <w:fldChar w:fldCharType="separate"/>
+            </w:r>
+            <w:r>
+              <w:rPr>
+                <w:noProof/>
+                <w:webHidden/>
+              </w:rPr>
+              <w:t>10</w:t>
+            </w:r>
+            <w:r>
+              <w:rPr>
+                <w:noProof/>
+                <w:webHidden/>
+              </w:rPr>
+              <w:fldChar w:fldCharType="end"/>
+            </w:r>
+          </w:hyperlink>
+        </w:p>
+        <w:p>
+          <w:pPr>
+            <w:pStyle w:val="TOC3"/>
+            <w:tabs>
+              <w:tab w:val="right" w:leader="dot" w:pos="9350"/>
+            </w:tabs>
+            <w:rPr>
+              <w:noProof/>
+            </w:rPr>
+          </w:pPr>
+          <w:hyperlink w:anchor="_Toc237764633" w:history="1">
+            <w:r>
+              <w:rPr>
+                <w:rStyle w:val="Hyperlink"/>
+                <w:b/>
+                <w:bCs/>
+                <w:noProof/>
+              </w:rPr>
+              <w:t>Subscribe — Broker → ESP32 (Commands)</w:t>
+            </w:r>
+            <w:r>
+              <w:rPr>
+                <w:noProof/>
+                <w:webHidden/>
+              </w:rPr>
+              <w:tab/>
+            </w:r>
+            <w:r>
+              <w:rPr>
+                <w:noProof/>
+                <w:webHidden/>
+              </w:rPr>
+              <w:fldChar w:fldCharType="begin"/>
+            </w:r>
+            <w:r>
+              <w:rPr>
+                <w:noProof/>
+                <w:webHidden/>
+              </w:rPr>
+              <w:instrText xml:space="preserve"> PAGEREF _Toc237764633 \h </w:instrText>
+            </w:r>
+            <w:r>
+              <w:rPr>
+                <w:noProof/>
+                <w:webHidden/>
+              </w:rPr>
+            </w:r>
+            <w:r>
+              <w:rPr>
+                <w:noProof/>
+                <w:webHidden/>
+              </w:rPr>
+              <w:fldChar w:fldCharType="separate"/>
+            </w:r>
+            <w:r>
+              <w:rPr>
+                <w:noProof/>
+                <w:webHidden/>
+              </w:rPr>
+              <w:t>10</w:t>
+            </w:r>
+            <w:r>
+              <w:rPr>
+                <w:noProof/>
+                <w:webHidden/>
+              </w:rPr>
+              <w:fldChar w:fldCharType="end"/>
+            </w:r>
+          </w:hyperlink>
+        </w:p>
+        <w:p>
+          <w:pPr>
+            <w:pStyle w:val="TOC1"/>
+            <w:tabs>
+              <w:tab w:val="right" w:leader="dot" w:pos="9350"/>
+            </w:tabs>
+            <w:rPr>
+              <w:noProof/>
+            </w:rPr>
+          </w:pPr>
+          <w:hyperlink w:anchor="_Toc237764634" w:history="1">
+            <w:r>
+              <w:rPr>
+                <w:rStyle w:val="Hyperlink"/>
+                <w:b/>
+                <w:bCs/>
+                <w:noProof/>
+              </w:rPr>
+              <w:t>4. Part 3 — Firmware Requirements &amp; Safety Behaviour</w:t>
+            </w:r>
+            <w:r>
+              <w:rPr>
+                <w:noProof/>
+                <w:webHidden/>
+              </w:rPr>
+              <w:tab/>
+            </w:r>
+            <w:r>
+              <w:rPr>
+                <w:noProof/>
+                <w:webHidden/>
+              </w:rPr>
+              <w:fldChar w:fldCharType="begin"/>
+            </w:r>
+            <w:r>
+              <w:rPr>
+                <w:noProof/>
+                <w:webHidden/>
+              </w:rPr>
+              <w:instrText xml:space="preserve"> PAGEREF _Toc237764634 \h </w:instrText>
+            </w:r>
+            <w:r>
+              <w:rPr>
+                <w:noProof/>
+                <w:webHidden/>
+              </w:rPr>
+            </w:r>
+            <w:r>
+              <w:rPr>
+                <w:noProof/>
+                <w:webHidden/>
+              </w:rPr>
+              <w:fldChar w:fldCharType="separate"/>
+            </w:r>
+            <w:r>
+              <w:rPr>
+                <w:noProof/>
+                <w:webHidden/>
+              </w:rPr>
+              <w:t>10</w:t>
+            </w:r>
+            <w:r>
+              <w:rPr>
+                <w:noProof/>
+                <w:webHidden/>
+              </w:rPr>
+              <w:fldChar w:fldCharType="end"/>
+            </w:r>
+          </w:hyperlink>
+        </w:p>
+        <w:p>
+          <w:pPr>
+            <w:pStyle w:val="TOC1"/>
+            <w:tabs>
+              <w:tab w:val="right" w:leader="dot" w:pos="9350"/>
+            </w:tabs>
+            <w:rPr>
+              <w:noProof/>
+            </w:rPr>
+          </w:pPr>
+          <w:hyperlink w:anchor="_Toc237764635" w:history="1">
+            <w:r>
+              <w:rPr>
+                <w:rStyle w:val="Hyperlink"/>
+                <w:b/>
+                <w:bCs/>
+                <w:noProof/>
+              </w:rPr>
+              <w:t>5. Firmware Architecture</w:t>
+            </w:r>
+            <w:r>
+              <w:rPr>
+                <w:noProof/>
+                <w:webHidden/>
+              </w:rPr>
+              <w:tab/>
+            </w:r>
+            <w:r>
+              <w:rPr>
+                <w:noProof/>
+                <w:webHidden/>
+              </w:rPr>
+              <w:fldChar w:fldCharType="begin"/>
+            </w:r>
+            <w:r>
+              <w:rPr>
+                <w:noProof/>
+                <w:webHidden/>
+              </w:rPr>
+              <w:instrText xml:space="preserve"> PAGEREF _Toc237764635 \h </w:instrText>
+            </w:r>
+            <w:r>
+              <w:rPr>
+                <w:noProof/>
+                <w:webHidden/>
+              </w:rPr>
+            </w:r>
+            <w:r>
+              <w:rPr>
+                <w:noProof/>
+                <w:webHidden/>
+              </w:rPr>
+              <w:fldChar w:fldCharType="separate"/>
+            </w:r>
+            <w:r>
+              <w:rPr>
+                <w:noProof/>
+                <w:webHidden/>
+              </w:rPr>
+              <w:t>12</w:t>
+            </w:r>
+            <w:r>
+              <w:rPr>
+                <w:noProof/>
+                <w:webHidden/>
+              </w:rPr>
+              <w:fldChar w:fldCharType="end"/>
+            </w:r>
+          </w:hyperlink>
+        </w:p>
+        <w:p>
+          <w:pPr>
+            <w:pStyle w:val="TOC2"/>
+            <w:tabs>
+              <w:tab w:val="right" w:leader="dot" w:pos="9350"/>
+            </w:tabs>
+            <w:rPr>
+              <w:noProof/>
+            </w:rPr>
+          </w:pPr>
+          <w:hyperlink w:anchor="_Toc237764636" w:history="1">
+            <w:r>
+              <w:rPr>
+                <w:rStyle w:val="Hyperlink"/>
+                <w:b/>
+                <w:bCs/>
+                <w:noProof/>
+              </w:rPr>
+              <w:t>5.1 L298N Motor Driver Class</w:t>
+            </w:r>
+            <w:r>
+              <w:rPr>
+                <w:noProof/>
+                <w:webHidden/>
+              </w:rPr>
+              <w:tab/>
+            </w:r>
+            <w:r>
+              <w:rPr>
+                <w:noProof/>
+                <w:webHidden/>
+              </w:rPr>
+              <w:fldChar w:fldCharType="begin"/>
+            </w:r>
+            <w:r>
+              <w:rPr>
+                <w:noProof/>
+                <w:webHidden/>
+              </w:rPr>
+              <w:instrText xml:space="preserve"> PAGEREF _Toc237764636 \h </w:instrText>
+            </w:r>
+            <w:r>
+              <w:rPr>
+                <w:noProof/>
+                <w:webHidden/>
+              </w:rPr>
+            </w:r>
+            <w:r>
+              <w:rPr>
+                <w:noProof/>
+                <w:webHidden/>
+              </w:rPr>
+              <w:fldChar w:fldCharType="separate"/>
+            </w:r>
+            <w:r>
+              <w:rPr>
+                <w:noProof/>
+                <w:webHidden/>
+              </w:rPr>
+              <w:t>12</w:t>
+            </w:r>
+            <w:r>
+              <w:rPr>
+                <w:noProof/>
+                <w:webHidden/>
+              </w:rPr>
+              <w:fldChar w:fldCharType="end"/>
+            </w:r>
+          </w:hyperlink>
+        </w:p>
+        <w:p>
+          <w:pPr>
+            <w:pStyle w:val="TOC2"/>
+            <w:tabs>
+              <w:tab w:val="right" w:leader="dot" w:pos="9350"/>
+            </w:tabs>
+            <w:rPr>
+              <w:noProof/>
+            </w:rPr>
+          </w:pPr>
+          <w:hyperlink w:anchor="_Toc237764637" w:history="1">
+            <w:r>
+              <w:rPr>
+                <w:rStyle w:val="Hyperlink"/>
+                <w:b/>
+                <w:bCs/>
+                <w:noProof/>
+              </w:rPr>
+              <w:t>5.2 Main Application Flow (setup / loop)</w:t>
+            </w:r>
+            <w:r>
+              <w:rPr>
+                <w:noProof/>
+                <w:webHidden/>
+              </w:rPr>
+              <w:tab/>
+            </w:r>
+            <w:r>
+              <w:rPr>
+                <w:noProof/>
+                <w:webHidden/>
+              </w:rPr>
+              <w:fldChar w:fldCharType="begin"/>
+            </w:r>
+            <w:r>
+              <w:rPr>
+                <w:noProof/>
+                <w:webHidden/>
+              </w:rPr>
+              <w:instrText xml:space="preserve"> PAGEREF _Toc237764637 \h </w:instrText>
+            </w:r>
+            <w:r>
+              <w:rPr>
+                <w:noProof/>
+                <w:webHidden/>
+              </w:rPr>
+            </w:r>
+            <w:r>
+              <w:rPr>
+                <w:noProof/>
+                <w:webHidden/>
+              </w:rPr>
+              <w:fldChar w:fldCharType="separate"/>
+            </w:r>
+            <w:r>
+              <w:rPr>
+                <w:noProof/>
+                <w:webHidden/>
+              </w:rPr>
+              <w:t>13</w:t>
+            </w:r>
+            <w:r>
+              <w:rPr>
+                <w:noProof/>
+                <w:webHidden/>
+              </w:rPr>
+              <w:fldChar w:fldCharType="end"/>
+            </w:r>
+          </w:hyperlink>
+        </w:p>
+        <w:p>
+          <w:pPr>
+            <w:pStyle w:val="TOC2"/>
+            <w:tabs>
+              <w:tab w:val="right" w:leader="dot" w:pos="9350"/>
+            </w:tabs>
+            <w:rPr>
+              <w:noProof/>
+            </w:rPr>
+          </w:pPr>
+          <w:hyperlink w:anchor="_Toc237764638" w:history="1">
+            <w:r>
+              <w:rPr>
+                <w:rStyle w:val="Hyperlink"/>
+                <w:b/>
+                <w:bCs/>
+                <w:noProof/>
+              </w:rPr>
+              <w:t>5.3 mqttCallback — Command Ingestion</w:t>
+            </w:r>
+            <w:r>
+              <w:rPr>
+                <w:noProof/>
+                <w:webHidden/>
+              </w:rPr>
+              <w:tab/>
+            </w:r>
+            <w:r>
+              <w:rPr>
+                <w:noProof/>
+                <w:webHidden/>
+              </w:rPr>
+              <w:fldChar w:fldCharType="begin"/>
+            </w:r>
+            <w:r>
+              <w:rPr>
+                <w:noProof/>
+                <w:webHidden/>
+              </w:rPr>
+              <w:instrText xml:space="preserve"> PAGEREF _Toc237764638 \h </w:instrText>
+            </w:r>
+            <w:r>
+              <w:rPr>
+                <w:noProof/>
+                <w:webHidden/>
+              </w:rPr>
+            </w:r>
+            <w:r>
+              <w:rPr>
+                <w:noProof/>
+                <w:webHidden/>
+              </w:rPr>
+              <w:fldChar w:fldCharType="separate"/>
+            </w:r>
+            <w:r>
+              <w:rPr>
+                <w:noProof/>
+                <w:webHidden/>
+              </w:rPr>
+              <w:t>13</w:t>
+            </w:r>
+            <w:r>
+              <w:rPr>
+                <w:noProof/>
+                <w:webHidden/>
+              </w:rPr>
+              <w:fldChar w:fldCharType="end"/>
+            </w:r>
+          </w:hyperlink>
+        </w:p>
+        <w:p>
+          <w:pPr>
+            <w:pStyle w:val="TOC2"/>
+            <w:tabs>
+              <w:tab w:val="right" w:leader="dot" w:pos="9350"/>
+            </w:tabs>
+            <w:rPr>
+              <w:noProof/>
+            </w:rPr>
+          </w:pPr>
+          <w:hyperlink w:anchor="_Toc237764639" w:history="1">
+            <w:r>
+              <w:rPr>
+                <w:rStyle w:val="Hyperlink"/>
+                <w:b/>
+                <w:bCs/>
+                <w:noProof/>
+              </w:rPr>
+              <w:t>5.4 ensureConnections — Reconnect &amp; Failsafe</w:t>
+            </w:r>
+            <w:r>
+              <w:rPr>
+                <w:noProof/>
+                <w:webHidden/>
+              </w:rPr>
+              <w:tab/>
+            </w:r>
+            <w:r>
+              <w:rPr>
+                <w:noProof/>
+                <w:webHidden/>
+              </w:rPr>
+              <w:fldChar w:fldCharType="begin"/>
+            </w:r>
+            <w:r>
+              <w:rPr>
+                <w:noProof/>
+                <w:webHidden/>
+              </w:rPr>
+              <w:instrText xml:space="preserve"> PAGEREF _Toc237764639 \h </w:instrText>
+            </w:r>
+            <w:r>
+              <w:rPr>
+                <w:noProof/>
+                <w:webHidden/>
+              </w:rPr>
+            </w:r>
+            <w:r>
+              <w:rPr>
+                <w:noProof/>
+                <w:webHidden/>
+              </w:rPr>
+              <w:fldChar w:fldCharType="separate"/>
+            </w:r>
+            <w:r>
+              <w:rPr>
+                <w:noProof/>
+                <w:webHidden/>
+              </w:rPr>
+              <w:t>14</w:t>
+            </w:r>
+            <w:r>
+              <w:rPr>
+                <w:noProof/>
+                <w:webHidden/>
+              </w:rPr>
+              <w:fldChar w:fldCharType="end"/>
+            </w:r>
+          </w:hyperlink>
+        </w:p>
+        <w:p>
+          <w:pPr>
+            <w:pStyle w:val="TOC2"/>
+            <w:tabs>
+              <w:tab w:val="right" w:leader="dot" w:pos="9350"/>
+            </w:tabs>
+            <w:rPr>
+              <w:noProof/>
+            </w:rPr>
+          </w:pPr>
+          <w:hyperlink w:anchor="_Toc237764640" w:history="1">
+            <w:r>
+              <w:rPr>
+                <w:rStyle w:val="Hyperlink"/>
+                <w:b/>
+                <w:bCs/>
+                <w:noProof/>
+              </w:rPr>
+              <w:t>5.5 applyMotorHardware — Failsafe Engine</w:t>
+            </w:r>
+            <w:r>
+              <w:rPr>
+                <w:noProof/>
+                <w:webHidden/>
+              </w:rPr>
+              <w:tab/>
+            </w:r>
+            <w:r>
+              <w:rPr>
+                <w:noProof/>
+                <w:webHidden/>
+              </w:rPr>
+              <w:fldChar w:fldCharType="begin"/>
+            </w:r>
+            <w:r>
+              <w:rPr>
+                <w:noProof/>
+                <w:webHidden/>
+              </w:rPr>
+              <w:instrText xml:space="preserve"> PAGEREF _Toc237764640 \h </w:instrText>
+            </w:r>
+            <w:r>
+              <w:rPr>
+                <w:noProof/>
+                <w:webHidden/>
+              </w:rPr>
+            </w:r>
+            <w:r>
+              <w:rPr>
+                <w:noProof/>
+                <w:webHidden/>
+              </w:rPr>
+              <w:fldChar w:fldCharType="separate"/>
+            </w:r>
+            <w:r>
+              <w:rPr>
+                <w:noProof/>
+                <w:webHidden/>
+              </w:rPr>
+              <w:t>14</w:t>
+            </w:r>
+            <w:r>
+              <w:rPr>
+                <w:noProof/>
+                <w:webHidden/>
+              </w:rPr>
+              <w:fldChar w:fldCharType="end"/>
+            </w:r>
+          </w:hyperlink>
+        </w:p>
+        <w:p>
+          <w:pPr>
+            <w:pStyle w:val="TOC2"/>
+            <w:tabs>
+              <w:tab w:val="right" w:leader="dot" w:pos="9350"/>
+            </w:tabs>
+            <w:rPr>
+              <w:noProof/>
+            </w:rPr>
+          </w:pPr>
+          <w:hyperlink w:anchor="_Toc237764641" w:history="1">
+            <w:r>
+              <w:rPr>
+                <w:rStyle w:val="Hyperlink"/>
+                <w:b/>
+                <w:bCs/>
+                <w:noProof/>
+              </w:rPr>
+              <w:t>5.6 publishMotorStatus — True-State Reporter</w:t>
+            </w:r>
+            <w:r>
+              <w:rPr>
+                <w:noProof/>
+                <w:webHidden/>
+              </w:rPr>
+              <w:tab/>
+            </w:r>
+            <w:r>
+              <w:rPr>
+                <w:noProof/>
+                <w:webHidden/>
+              </w:rPr>
+              <w:fldChar w:fldCharType="begin"/>
+            </w:r>
+            <w:r>
+              <w:rPr>
+                <w:noProof/>
+                <w:webHidden/>
+              </w:rPr>
+              <w:instrText xml:space="preserve"> PAGEREF _Toc237764641 \h </w:instrText>
+            </w:r>
+            <w:r>
+              <w:rPr>
+                <w:noProof/>
+                <w:webHidden/>
+              </w:rPr>
+            </w:r>
+            <w:r>
+              <w:rPr>
+                <w:noProof/>
+                <w:webHidden/>
+              </w:rPr>
+              <w:fldChar w:fldCharType="separate"/>
+            </w:r>
+            <w:r>
+              <w:rPr>
+                <w:noProof/>
+                <w:webHidden/>
+              </w:rPr>
+              <w:t>15</w:t>
+            </w:r>
+            <w:r>
+              <w:rPr>
+                <w:noProof/>
+                <w:webHidden/>
+              </w:rPr>
+              <w:fldChar w:fldCharType="end"/>
+            </w:r>
+          </w:hyperlink>
+        </w:p>
+        <w:p>
+          <w:pPr>
+            <w:pStyle w:val="TOC1"/>
+            <w:tabs>
+              <w:tab w:val="right" w:leader="dot" w:pos="9350"/>
+            </w:tabs>
+            <w:rPr>
+              <w:noProof/>
+            </w:rPr>
+          </w:pPr>
+          <w:hyperlink w:anchor="_Toc237764642" w:history="1">
+            <w:r>
+              <w:rPr>
+                <w:rStyle w:val="Hyperlink"/>
+                <w:b/>
+                <w:bCs/>
+                <w:noProof/>
+              </w:rPr>
+              <w:t>6. End-to-End Verification &amp; Screenshots</w:t>
+            </w:r>
+            <w:r>
+              <w:rPr>
+                <w:noProof/>
+                <w:webHidden/>
+              </w:rPr>
+              <w:tab/>
+            </w:r>
+            <w:r>
+              <w:rPr>
+                <w:noProof/>
+                <w:webHidden/>
+              </w:rPr>
+              <w:fldChar w:fldCharType="begin"/>
+            </w:r>
+            <w:r>
+              <w:rPr>
+                <w:noProof/>
+                <w:webHidden/>
+              </w:rPr>
+              <w:instrText xml:space="preserve"> PAGEREF _Toc237764642 \h </w:instrText>
+            </w:r>
+            <w:r>
+              <w:rPr>
+                <w:noProof/>
+                <w:webHidden/>
+              </w:rPr>
+            </w:r>
+            <w:r>
+              <w:rPr>
+                <w:noProof/>
+                <w:webHidden/>
+              </w:rPr>
+              <w:fldChar w:fldCharType="separate"/>
+            </w:r>
+            <w:r>
+              <w:rPr>
+                <w:noProof/>
+                <w:webHidden/>
+              </w:rPr>
+              <w:t>16</w:t>
+            </w:r>
+            <w:r>
+              <w:rPr>
+                <w:noProof/>
+                <w:webHidden/>
+              </w:rPr>
+              <w:fldChar w:fldCharType="end"/>
+            </w:r>
+          </w:hyperlink>
+        </w:p>
+        <w:p>
+          <w:pPr>
+            <w:pStyle w:val="TOC1"/>
+            <w:tabs>
+              <w:tab w:val="right" w:leader="dot" w:pos="9350"/>
+            </w:tabs>
+            <w:rPr>
+              <w:noProof/>
+            </w:rPr>
+          </w:pPr>
+          <w:hyperlink w:anchor="_Toc237764643" w:history="1">
+            <w:r>
+              <w:rPr>
+                <w:rStyle w:val="Hyperlink"/>
+                <w:b/>
+                <w:bCs/>
+                <w:noProof/>
+              </w:rPr>
+              <w:t>8. References</w:t>
+            </w:r>
+            <w:r>
+              <w:rPr>
+                <w:noProof/>
+                <w:webHidden/>
+              </w:rPr>
+              <w:tab/>
+            </w:r>
+            <w:r>
+              <w:rPr>
+                <w:noProof/>
+                <w:webHidden/>
+              </w:rPr>
+              <w:fldChar w:fldCharType="begin"/>
+            </w:r>
+            <w:r>
+              <w:rPr>
+                <w:noProof/>
+                <w:webHidden/>
+              </w:rPr>
+              <w:instrText xml:space="preserve"> PAGEREF _Toc237764643 \h </w:instrText>
+            </w:r>
+            <w:r>
+              <w:rPr>
+                <w:noProof/>
+                <w:webHidden/>
+              </w:rPr>
+            </w:r>
+            <w:r>
+              <w:rPr>
+                <w:noProof/>
+                <w:webHidden/>
+              </w:rPr>
+              <w:fldChar w:fldCharType="separate"/>
+            </w:r>
+            <w:r>
+              <w:rPr>
+                <w:noProof/>
+                <w:webHidden/>
+              </w:rPr>
+              <w:t>17</w:t>
+            </w:r>
+            <w:r>
+              <w:rPr>
+                <w:noProof/>
+                <w:webHidden/>
+              </w:rPr>
+              <w:fldChar w:fldCharType="end"/>
+            </w:r>
+          </w:hyperlink>
+        </w:p>
+        <w:p>
+          <w:r>
+            <w:rPr>
+              <w:b/>
+              <w:bCs/>
+              <w:lang w:val="en-GB"/>
+            </w:rPr>
+            <w:fldChar w:fldCharType="end"/>
+          </w:r>
+        </w:p>
+      </w:sdtContent>
+    </w:sdt>
     <w:p>
       <w:r>
         <w:br w:type="page"/>
@@ -911,6 +2381,7 @@
         <w:pStyle w:val="Heading1"/>
         <w:spacing w:before="360" w:after="200"/>
       </w:pPr>
+      <w:bookmarkStart w:id="0" w:name="_Toc237764617"/>
       <w:r>
         <w:rPr>
           <w:b/>
@@ -919,12 +2390,14 @@
         <w:lastRenderedPageBreak/>
         <w:t>1. Daily Overview</w:t>
       </w:r>
+      <w:bookmarkEnd w:id="0"/>
     </w:p>
     <w:p>
       <w:pPr>
         <w:pStyle w:val="Heading2"/>
         <w:spacing w:before="280" w:after="160"/>
       </w:pPr>
+      <w:bookmarkStart w:id="1" w:name="_Toc237764618"/>
       <w:r>
         <w:rPr>
           <w:b/>
@@ -932,6 +2405,7 @@
         </w:rPr>
         <w:t>1.1 Summary</w:t>
       </w:r>
+      <w:bookmarkEnd w:id="1"/>
     </w:p>
     <w:p>
       <w:pPr>
@@ -1021,6 +2495,7 @@
         <w:pStyle w:val="Heading2"/>
         <w:spacing w:before="280" w:after="160"/>
       </w:pPr>
+      <w:bookmarkStart w:id="2" w:name="_Toc237764619"/>
       <w:r>
         <w:rPr>
           <w:b/>
@@ -1028,6 +2503,7 @@
         </w:rPr>
         <w:t>1.2 Goal &amp; Submission Format</w:t>
       </w:r>
+      <w:bookmarkEnd w:id="2"/>
     </w:p>
     <w:p>
       <w:pPr>
@@ -1056,12 +2532,6 @@
         <w:gridCol w:w="9325"/>
       </w:tblGrid>
       <w:tr>
-        <w:tblPrEx>
-          <w:tblCellMar>
-            <w:top w:w="0" w:type="dxa"/>
-            <w:bottom w:w="0" w:type="dxa"/>
-          </w:tblCellMar>
-        </w:tblPrEx>
         <w:tc>
           <w:tcPr>
             <w:tcW w:w="0" w:type="auto"/>
@@ -1123,6 +2593,7 @@
         <w:pStyle w:val="Heading2"/>
         <w:spacing w:before="280" w:after="160"/>
       </w:pPr>
+      <w:bookmarkStart w:id="3" w:name="_Toc237764620"/>
       <w:r>
         <w:rPr>
           <w:b/>
@@ -1130,6 +2601,7 @@
         </w:rPr>
         <w:t>1.3 Tasks Completed Today</w:t>
       </w:r>
+      <w:bookmarkEnd w:id="3"/>
     </w:p>
     <w:p>
       <w:pPr>
@@ -1413,6 +2885,7 @@
         <w:pStyle w:val="Heading1"/>
         <w:spacing w:before="360" w:after="200"/>
       </w:pPr>
+      <w:bookmarkStart w:id="4" w:name="_Toc237764621"/>
       <w:r>
         <w:rPr>
           <w:b/>
@@ -1421,12 +2894,14 @@
         <w:lastRenderedPageBreak/>
         <w:t>2. Part 1 — Local Broker Setup on Windows</w:t>
       </w:r>
+      <w:bookmarkEnd w:id="4"/>
     </w:p>
     <w:p>
       <w:pPr>
         <w:pStyle w:val="Heading2"/>
         <w:spacing w:before="280" w:after="160"/>
       </w:pPr>
+      <w:bookmarkStart w:id="5" w:name="_Toc237764622"/>
       <w:r>
         <w:rPr>
           <w:b/>
@@ -1450,6 +2925,7 @@
         </w:rPr>
         <w:t xml:space="preserve"> Install Fails Remote Devices</w:t>
       </w:r>
+      <w:bookmarkEnd w:id="5"/>
     </w:p>
     <w:p>
       <w:pPr>
@@ -1507,6 +2983,7 @@
         <w:pStyle w:val="Heading2"/>
         <w:spacing w:before="280" w:after="160"/>
       </w:pPr>
+      <w:bookmarkStart w:id="6" w:name="_Toc237764623"/>
       <w:r>
         <w:rPr>
           <w:b/>
@@ -1514,6 +2991,7 @@
         </w:rPr>
         <w:t>2.2 Network Architecture — Windows + WSL 2 + ESP32</w:t>
       </w:r>
+      <w:bookmarkEnd w:id="6"/>
     </w:p>
     <w:p>
       <w:pPr>
@@ -1930,6 +3408,7 @@
         <w:pStyle w:val="Heading3"/>
         <w:spacing w:before="220" w:after="120"/>
       </w:pPr>
+      <w:bookmarkStart w:id="7" w:name="_Toc237764624"/>
       <w:r>
         <w:rPr>
           <w:b/>
@@ -1937,6 +3416,7 @@
         </w:rPr>
         <w:t>Key Technical Concepts</w:t>
       </w:r>
+      <w:bookmarkEnd w:id="7"/>
     </w:p>
     <w:tbl>
       <w:tblPr>
@@ -1960,12 +3440,6 @@
         <w:gridCol w:w="6800"/>
       </w:tblGrid>
       <w:tr>
-        <w:tblPrEx>
-          <w:tblCellMar>
-            <w:top w:w="0" w:type="dxa"/>
-            <w:bottom w:w="0" w:type="dxa"/>
-          </w:tblCellMar>
-        </w:tblPrEx>
         <w:tc>
           <w:tcPr>
             <w:tcW w:w="2600" w:type="dxa"/>
@@ -2014,12 +3488,6 @@
         </w:tc>
       </w:tr>
       <w:tr>
-        <w:tblPrEx>
-          <w:tblCellMar>
-            <w:top w:w="0" w:type="dxa"/>
-            <w:bottom w:w="0" w:type="dxa"/>
-          </w:tblCellMar>
-        </w:tblPrEx>
         <w:tc>
           <w:tcPr>
             <w:tcW w:w="2600" w:type="dxa"/>
@@ -2066,12 +3534,6 @@
         </w:tc>
       </w:tr>
       <w:tr>
-        <w:tblPrEx>
-          <w:tblCellMar>
-            <w:top w:w="0" w:type="dxa"/>
-            <w:bottom w:w="0" w:type="dxa"/>
-          </w:tblCellMar>
-        </w:tblPrEx>
         <w:tc>
           <w:tcPr>
             <w:tcW w:w="2600" w:type="dxa"/>
@@ -2110,12 +3572,6 @@
         </w:tc>
       </w:tr>
       <w:tr>
-        <w:tblPrEx>
-          <w:tblCellMar>
-            <w:top w:w="0" w:type="dxa"/>
-            <w:bottom w:w="0" w:type="dxa"/>
-          </w:tblCellMar>
-        </w:tblPrEx>
         <w:tc>
           <w:tcPr>
             <w:tcW w:w="2600" w:type="dxa"/>
@@ -2164,12 +3620,6 @@
         </w:tc>
       </w:tr>
       <w:tr>
-        <w:tblPrEx>
-          <w:tblCellMar>
-            <w:top w:w="0" w:type="dxa"/>
-            <w:bottom w:w="0" w:type="dxa"/>
-          </w:tblCellMar>
-        </w:tblPrEx>
         <w:tc>
           <w:tcPr>
             <w:tcW w:w="2600" w:type="dxa"/>
@@ -2213,6 +3663,7 @@
         <w:pStyle w:val="Heading2"/>
         <w:spacing w:before="280" w:after="160"/>
       </w:pPr>
+      <w:bookmarkStart w:id="8" w:name="_Toc237764625"/>
       <w:r>
         <w:rPr>
           <w:b/>
@@ -2220,6 +3671,7 @@
         </w:rPr>
         <w:t>2.3 Installation &amp; Port Conflict Resolution</w:t>
       </w:r>
+      <w:bookmarkEnd w:id="8"/>
     </w:p>
     <w:p>
       <w:pPr>
@@ -2601,6 +4053,7 @@
         <w:pStyle w:val="Heading2"/>
         <w:spacing w:before="280" w:after="160"/>
       </w:pPr>
+      <w:bookmarkStart w:id="9" w:name="_Toc237764626"/>
       <w:r>
         <w:rPr>
           <w:b/>
@@ -2624,6 +4077,7 @@
         </w:rPr>
         <w:t xml:space="preserve"> — Configuration &amp; Rationale</w:t>
       </w:r>
+      <w:bookmarkEnd w:id="9"/>
     </w:p>
     <w:p>
       <w:pPr>
@@ -2795,12 +4249,6 @@
         <w:gridCol w:w="6000"/>
       </w:tblGrid>
       <w:tr>
-        <w:tblPrEx>
-          <w:tblCellMar>
-            <w:top w:w="0" w:type="dxa"/>
-            <w:bottom w:w="0" w:type="dxa"/>
-          </w:tblCellMar>
-        </w:tblPrEx>
         <w:tc>
           <w:tcPr>
             <w:tcW w:w="3400" w:type="dxa"/>
@@ -2849,12 +4297,6 @@
         </w:tc>
       </w:tr>
       <w:tr>
-        <w:tblPrEx>
-          <w:tblCellMar>
-            <w:top w:w="0" w:type="dxa"/>
-            <w:bottom w:w="0" w:type="dxa"/>
-          </w:tblCellMar>
-        </w:tblPrEx>
         <w:tc>
           <w:tcPr>
             <w:tcW w:w="3400" w:type="dxa"/>
@@ -2909,12 +4351,6 @@
         </w:tc>
       </w:tr>
       <w:tr>
-        <w:tblPrEx>
-          <w:tblCellMar>
-            <w:top w:w="0" w:type="dxa"/>
-            <w:bottom w:w="0" w:type="dxa"/>
-          </w:tblCellMar>
-        </w:tblPrEx>
         <w:tc>
           <w:tcPr>
             <w:tcW w:w="3400" w:type="dxa"/>
@@ -3207,6 +4643,7 @@
         <w:pStyle w:val="Heading2"/>
         <w:spacing w:before="280" w:after="160"/>
       </w:pPr>
+      <w:bookmarkStart w:id="10" w:name="_Toc237764627"/>
       <w:r>
         <w:rPr>
           <w:b/>
@@ -3214,6 +4651,7 @@
         </w:rPr>
         <w:t>2.5 Windows Firewall Rule</w:t>
       </w:r>
+      <w:bookmarkEnd w:id="10"/>
     </w:p>
     <w:p>
       <w:pPr>
@@ -3407,12 +4845,6 @@
         <w:gridCol w:w="9325"/>
       </w:tblGrid>
       <w:tr>
-        <w:tblPrEx>
-          <w:tblCellMar>
-            <w:top w:w="0" w:type="dxa"/>
-            <w:bottom w:w="0" w:type="dxa"/>
-          </w:tblCellMar>
-        </w:tblPrEx>
         <w:tc>
           <w:tcPr>
             <w:tcW w:w="0" w:type="auto"/>
@@ -3466,6 +4898,7 @@
         <w:pStyle w:val="Heading2"/>
         <w:spacing w:before="280" w:after="160"/>
       </w:pPr>
+      <w:bookmarkStart w:id="11" w:name="_Toc237764628"/>
       <w:r>
         <w:rPr>
           <w:b/>
@@ -3473,6 +4906,7 @@
         </w:rPr>
         <w:t>2.6 WSL 2 NAT Boundary &amp; Port Proxy</w:t>
       </w:r>
+      <w:bookmarkEnd w:id="11"/>
     </w:p>
     <w:p>
       <w:pPr>
@@ -4164,6 +5598,7 @@
         <w:pStyle w:val="Heading2"/>
         <w:spacing w:before="280" w:after="160"/>
       </w:pPr>
+      <w:bookmarkStart w:id="12" w:name="_Toc237764629"/>
       <w:r>
         <w:rPr>
           <w:b/>
@@ -4195,6 +5630,7 @@
         </w:rPr>
         <w:t>mosquitto_sub</w:t>
       </w:r>
+      <w:bookmarkEnd w:id="12"/>
       <w:proofErr w:type="spellEnd"/>
     </w:p>
     <w:p>
@@ -4585,6 +6021,7 @@
         <w:pStyle w:val="Heading2"/>
         <w:spacing w:before="280" w:after="160"/>
       </w:pPr>
+      <w:bookmarkStart w:id="13" w:name="_Toc237764630"/>
       <w:r>
         <w:rPr>
           <w:b/>
@@ -4592,6 +6029,7 @@
         </w:rPr>
         <w:t>2.8 MQTT Explorer Setup</w:t>
       </w:r>
+      <w:bookmarkEnd w:id="13"/>
     </w:p>
     <w:p>
       <w:pPr>
@@ -4631,12 +6069,6 @@
         <w:gridCol w:w="6200"/>
       </w:tblGrid>
       <w:tr>
-        <w:tblPrEx>
-          <w:tblCellMar>
-            <w:top w:w="0" w:type="dxa"/>
-            <w:bottom w:w="0" w:type="dxa"/>
-          </w:tblCellMar>
-        </w:tblPrEx>
         <w:tc>
           <w:tcPr>
             <w:tcW w:w="3200" w:type="dxa"/>
@@ -4685,12 +6117,6 @@
         </w:tc>
       </w:tr>
       <w:tr>
-        <w:tblPrEx>
-          <w:tblCellMar>
-            <w:top w:w="0" w:type="dxa"/>
-            <w:bottom w:w="0" w:type="dxa"/>
-          </w:tblCellMar>
-        </w:tblPrEx>
         <w:tc>
           <w:tcPr>
             <w:tcW w:w="3200" w:type="dxa"/>
@@ -4729,12 +6155,6 @@
         </w:tc>
       </w:tr>
       <w:tr>
-        <w:tblPrEx>
-          <w:tblCellMar>
-            <w:top w:w="0" w:type="dxa"/>
-            <w:bottom w:w="0" w:type="dxa"/>
-          </w:tblCellMar>
-        </w:tblPrEx>
         <w:tc>
           <w:tcPr>
             <w:tcW w:w="3200" w:type="dxa"/>
@@ -4778,12 +6198,6 @@
         </w:tc>
       </w:tr>
       <w:tr>
-        <w:tblPrEx>
-          <w:tblCellMar>
-            <w:top w:w="0" w:type="dxa"/>
-            <w:bottom w:w="0" w:type="dxa"/>
-          </w:tblCellMar>
-        </w:tblPrEx>
         <w:tc>
           <w:tcPr>
             <w:tcW w:w="3200" w:type="dxa"/>
@@ -4822,12 +6236,6 @@
         </w:tc>
       </w:tr>
       <w:tr>
-        <w:tblPrEx>
-          <w:tblCellMar>
-            <w:top w:w="0" w:type="dxa"/>
-            <w:bottom w:w="0" w:type="dxa"/>
-          </w:tblCellMar>
-        </w:tblPrEx>
         <w:tc>
           <w:tcPr>
             <w:tcW w:w="3200" w:type="dxa"/>
@@ -4949,6 +6357,7 @@
         <w:pStyle w:val="Heading1"/>
         <w:spacing w:before="360" w:after="200"/>
       </w:pPr>
+      <w:bookmarkStart w:id="14" w:name="_Toc237764631"/>
       <w:r>
         <w:rPr>
           <w:b/>
@@ -4957,6 +6366,7 @@
         <w:lastRenderedPageBreak/>
         <w:t>3. Part 2 — Topic Structure &amp; Namespace Design</w:t>
       </w:r>
+      <w:bookmarkEnd w:id="14"/>
     </w:p>
     <w:p>
       <w:pPr>
@@ -4979,6 +6389,7 @@
         <w:pStyle w:val="Heading3"/>
         <w:spacing w:before="220" w:after="120"/>
       </w:pPr>
+      <w:bookmarkStart w:id="15" w:name="_Toc237764632"/>
       <w:r>
         <w:rPr>
           <w:b/>
@@ -4986,6 +6397,7 @@
         </w:rPr>
         <w:t>Publish — ESP32 → Broker (Telemetry &amp; True State)</w:t>
       </w:r>
+      <w:bookmarkEnd w:id="15"/>
     </w:p>
     <w:tbl>
       <w:tblPr>
@@ -5010,12 +6422,6 @@
         <w:gridCol w:w="3600"/>
       </w:tblGrid>
       <w:tr>
-        <w:tblPrEx>
-          <w:tblCellMar>
-            <w:top w:w="0" w:type="dxa"/>
-            <w:bottom w:w="0" w:type="dxa"/>
-          </w:tblCellMar>
-        </w:tblPrEx>
         <w:tc>
           <w:tcPr>
             <w:tcW w:w="2800" w:type="dxa"/>
@@ -5087,12 +6493,6 @@
         </w:tc>
       </w:tr>
       <w:tr>
-        <w:tblPrEx>
-          <w:tblCellMar>
-            <w:top w:w="0" w:type="dxa"/>
-            <w:bottom w:w="0" w:type="dxa"/>
-          </w:tblCellMar>
-        </w:tblPrEx>
         <w:tc>
           <w:tcPr>
             <w:tcW w:w="2800" w:type="dxa"/>
@@ -5149,12 +6549,6 @@
         </w:tc>
       </w:tr>
       <w:tr>
-        <w:tblPrEx>
-          <w:tblCellMar>
-            <w:top w:w="0" w:type="dxa"/>
-            <w:bottom w:w="0" w:type="dxa"/>
-          </w:tblCellMar>
-        </w:tblPrEx>
         <w:tc>
           <w:tcPr>
             <w:tcW w:w="2800" w:type="dxa"/>
@@ -5211,12 +6605,6 @@
         </w:tc>
       </w:tr>
       <w:tr>
-        <w:tblPrEx>
-          <w:tblCellMar>
-            <w:top w:w="0" w:type="dxa"/>
-            <w:bottom w:w="0" w:type="dxa"/>
-          </w:tblCellMar>
-        </w:tblPrEx>
         <w:tc>
           <w:tcPr>
             <w:tcW w:w="2800" w:type="dxa"/>
@@ -5278,12 +6666,6 @@
         </w:tc>
       </w:tr>
       <w:tr>
-        <w:tblPrEx>
-          <w:tblCellMar>
-            <w:top w:w="0" w:type="dxa"/>
-            <w:bottom w:w="0" w:type="dxa"/>
-          </w:tblCellMar>
-        </w:tblPrEx>
         <w:tc>
           <w:tcPr>
             <w:tcW w:w="2800" w:type="dxa"/>
@@ -5340,12 +6722,6 @@
         </w:tc>
       </w:tr>
       <w:tr>
-        <w:tblPrEx>
-          <w:tblCellMar>
-            <w:top w:w="0" w:type="dxa"/>
-            <w:bottom w:w="0" w:type="dxa"/>
-          </w:tblCellMar>
-        </w:tblPrEx>
         <w:tc>
           <w:tcPr>
             <w:tcW w:w="2800" w:type="dxa"/>
@@ -5402,12 +6778,6 @@
         </w:tc>
       </w:tr>
       <w:tr>
-        <w:tblPrEx>
-          <w:tblCellMar>
-            <w:top w:w="0" w:type="dxa"/>
-            <w:bottom w:w="0" w:type="dxa"/>
-          </w:tblCellMar>
-        </w:tblPrEx>
         <w:tc>
           <w:tcPr>
             <w:tcW w:w="2800" w:type="dxa"/>
@@ -5469,6 +6839,7 @@
         <w:pStyle w:val="Heading3"/>
         <w:spacing w:before="220" w:after="120"/>
       </w:pPr>
+      <w:bookmarkStart w:id="16" w:name="_Toc237764633"/>
       <w:r>
         <w:rPr>
           <w:b/>
@@ -5476,6 +6847,7 @@
         </w:rPr>
         <w:t>Subscribe — Broker → ESP32 (Commands)</w:t>
       </w:r>
+      <w:bookmarkEnd w:id="16"/>
     </w:p>
     <w:tbl>
       <w:tblPr>
@@ -5500,12 +6872,6 @@
         <w:gridCol w:w="3600"/>
       </w:tblGrid>
       <w:tr>
-        <w:tblPrEx>
-          <w:tblCellMar>
-            <w:top w:w="0" w:type="dxa"/>
-            <w:bottom w:w="0" w:type="dxa"/>
-          </w:tblCellMar>
-        </w:tblPrEx>
         <w:tc>
           <w:tcPr>
             <w:tcW w:w="2800" w:type="dxa"/>
@@ -5577,12 +6943,6 @@
         </w:tc>
       </w:tr>
       <w:tr>
-        <w:tblPrEx>
-          <w:tblCellMar>
-            <w:top w:w="0" w:type="dxa"/>
-            <w:bottom w:w="0" w:type="dxa"/>
-          </w:tblCellMar>
-        </w:tblPrEx>
         <w:tc>
           <w:tcPr>
             <w:tcW w:w="2800" w:type="dxa"/>
@@ -5639,12 +6999,6 @@
         </w:tc>
       </w:tr>
       <w:tr>
-        <w:tblPrEx>
-          <w:tblCellMar>
-            <w:top w:w="0" w:type="dxa"/>
-            <w:bottom w:w="0" w:type="dxa"/>
-          </w:tblCellMar>
-        </w:tblPrEx>
         <w:tc>
           <w:tcPr>
             <w:tcW w:w="2800" w:type="dxa"/>
@@ -5701,12 +7055,6 @@
         </w:tc>
       </w:tr>
       <w:tr>
-        <w:tblPrEx>
-          <w:tblCellMar>
-            <w:top w:w="0" w:type="dxa"/>
-            <w:bottom w:w="0" w:type="dxa"/>
-          </w:tblCellMar>
-        </w:tblPrEx>
         <w:tc>
           <w:tcPr>
             <w:tcW w:w="2800" w:type="dxa"/>
@@ -5784,6 +7132,7 @@
         <w:pStyle w:val="Heading1"/>
         <w:spacing w:before="360" w:after="200"/>
       </w:pPr>
+      <w:bookmarkStart w:id="17" w:name="_Toc237764634"/>
       <w:r>
         <w:rPr>
           <w:b/>
@@ -5799,6 +7148,7 @@
         </w:rPr>
         <w:t>Behaviour</w:t>
       </w:r>
+      <w:bookmarkEnd w:id="17"/>
       <w:proofErr w:type="spellEnd"/>
     </w:p>
     <w:tbl>
@@ -5823,12 +7173,6 @@
         <w:gridCol w:w="6300"/>
       </w:tblGrid>
       <w:tr>
-        <w:tblPrEx>
-          <w:tblCellMar>
-            <w:top w:w="0" w:type="dxa"/>
-            <w:bottom w:w="0" w:type="dxa"/>
-          </w:tblCellMar>
-        </w:tblPrEx>
         <w:tc>
           <w:tcPr>
             <w:tcW w:w="3300" w:type="dxa"/>
@@ -5877,12 +7221,6 @@
         </w:tc>
       </w:tr>
       <w:tr>
-        <w:tblPrEx>
-          <w:tblCellMar>
-            <w:top w:w="0" w:type="dxa"/>
-            <w:bottom w:w="0" w:type="dxa"/>
-          </w:tblCellMar>
-        </w:tblPrEx>
         <w:tc>
           <w:tcPr>
             <w:tcW w:w="3300" w:type="dxa"/>
@@ -5963,12 +7301,6 @@
         </w:tc>
       </w:tr>
       <w:tr>
-        <w:tblPrEx>
-          <w:tblCellMar>
-            <w:top w:w="0" w:type="dxa"/>
-            <w:bottom w:w="0" w:type="dxa"/>
-          </w:tblCellMar>
-        </w:tblPrEx>
         <w:tc>
           <w:tcPr>
             <w:tcW w:w="3300" w:type="dxa"/>
@@ -6037,12 +7369,6 @@
         </w:tc>
       </w:tr>
       <w:tr>
-        <w:tblPrEx>
-          <w:tblCellMar>
-            <w:top w:w="0" w:type="dxa"/>
-            <w:bottom w:w="0" w:type="dxa"/>
-          </w:tblCellMar>
-        </w:tblPrEx>
         <w:tc>
           <w:tcPr>
             <w:tcW w:w="3300" w:type="dxa"/>
@@ -6112,12 +7438,6 @@
         </w:tc>
       </w:tr>
       <w:tr>
-        <w:tblPrEx>
-          <w:tblCellMar>
-            <w:top w:w="0" w:type="dxa"/>
-            <w:bottom w:w="0" w:type="dxa"/>
-          </w:tblCellMar>
-        </w:tblPrEx>
         <w:tc>
           <w:tcPr>
             <w:tcW w:w="3300" w:type="dxa"/>
@@ -6226,6 +7546,7 @@
         <w:pStyle w:val="Heading1"/>
         <w:spacing w:before="360" w:after="200"/>
       </w:pPr>
+      <w:bookmarkStart w:id="18" w:name="_Toc237764635"/>
       <w:r>
         <w:rPr>
           <w:b/>
@@ -6234,6 +7555,7 @@
         <w:lastRenderedPageBreak/>
         <w:t>5. Firmware Architecture</w:t>
       </w:r>
+      <w:bookmarkEnd w:id="18"/>
     </w:p>
     <w:p>
       <w:pPr>
@@ -6249,6 +7571,9 @@
         <w:jc w:val="center"/>
       </w:pPr>
       <w:r>
+        <w:rPr>
+          <w:noProof/>
+        </w:rPr>
         <w:drawing>
           <wp:inline distT="0" distB="0" distL="0" distR="0" wp14:anchorId="3E8A0706" wp14:editId="45B4D131">
             <wp:extent cx="5280660" cy="4042864"/>
@@ -6320,6 +7645,7 @@
         <w:pStyle w:val="Heading2"/>
         <w:spacing w:before="280" w:after="160"/>
       </w:pPr>
+      <w:bookmarkStart w:id="19" w:name="_Toc237764636"/>
       <w:r>
         <w:rPr>
           <w:b/>
@@ -6327,6 +7653,7 @@
         </w:rPr>
         <w:t>5.1 L298N Motor Driver Class</w:t>
       </w:r>
+      <w:bookmarkEnd w:id="19"/>
     </w:p>
     <w:tbl>
       <w:tblPr>
@@ -6350,12 +7677,6 @@
         <w:gridCol w:w="6600"/>
       </w:tblGrid>
       <w:tr>
-        <w:tblPrEx>
-          <w:tblCellMar>
-            <w:top w:w="0" w:type="dxa"/>
-            <w:bottom w:w="0" w:type="dxa"/>
-          </w:tblCellMar>
-        </w:tblPrEx>
         <w:tc>
           <w:tcPr>
             <w:tcW w:w="3000" w:type="dxa"/>
@@ -6406,12 +7727,6 @@
         </w:tc>
       </w:tr>
       <w:tr>
-        <w:tblPrEx>
-          <w:tblCellMar>
-            <w:top w:w="0" w:type="dxa"/>
-            <w:bottom w:w="0" w:type="dxa"/>
-          </w:tblCellMar>
-        </w:tblPrEx>
         <w:tc>
           <w:tcPr>
             <w:tcW w:w="3000" w:type="dxa"/>
@@ -6474,12 +7789,6 @@
         </w:tc>
       </w:tr>
       <w:tr>
-        <w:tblPrEx>
-          <w:tblCellMar>
-            <w:top w:w="0" w:type="dxa"/>
-            <w:bottom w:w="0" w:type="dxa"/>
-          </w:tblCellMar>
-        </w:tblPrEx>
         <w:tc>
           <w:tcPr>
             <w:tcW w:w="3000" w:type="dxa"/>
@@ -6531,12 +7840,6 @@
         </w:tc>
       </w:tr>
       <w:tr>
-        <w:tblPrEx>
-          <w:tblCellMar>
-            <w:top w:w="0" w:type="dxa"/>
-            <w:bottom w:w="0" w:type="dxa"/>
-          </w:tblCellMar>
-        </w:tblPrEx>
         <w:tc>
           <w:tcPr>
             <w:tcW w:w="3000" w:type="dxa"/>
@@ -6591,12 +7894,6 @@
         </w:tc>
       </w:tr>
       <w:tr>
-        <w:tblPrEx>
-          <w:tblCellMar>
-            <w:top w:w="0" w:type="dxa"/>
-            <w:bottom w:w="0" w:type="dxa"/>
-          </w:tblCellMar>
-        </w:tblPrEx>
         <w:tc>
           <w:tcPr>
             <w:tcW w:w="3000" w:type="dxa"/>
@@ -6651,12 +7948,6 @@
         </w:tc>
       </w:tr>
       <w:tr>
-        <w:tblPrEx>
-          <w:tblCellMar>
-            <w:top w:w="0" w:type="dxa"/>
-            <w:bottom w:w="0" w:type="dxa"/>
-          </w:tblCellMar>
-        </w:tblPrEx>
         <w:tc>
           <w:tcPr>
             <w:tcW w:w="3000" w:type="dxa"/>
@@ -6701,12 +7992,6 @@
         </w:tc>
       </w:tr>
       <w:tr>
-        <w:tblPrEx>
-          <w:tblCellMar>
-            <w:top w:w="0" w:type="dxa"/>
-            <w:bottom w:w="0" w:type="dxa"/>
-          </w:tblCellMar>
-        </w:tblPrEx>
         <w:tc>
           <w:tcPr>
             <w:tcW w:w="3000" w:type="dxa"/>
@@ -6750,12 +8035,6 @@
         </w:tc>
       </w:tr>
       <w:tr>
-        <w:tblPrEx>
-          <w:tblCellMar>
-            <w:top w:w="0" w:type="dxa"/>
-            <w:bottom w:w="0" w:type="dxa"/>
-          </w:tblCellMar>
-        </w:tblPrEx>
         <w:tc>
           <w:tcPr>
             <w:tcW w:w="3000" w:type="dxa"/>
@@ -6830,6 +8109,7 @@
         <w:pStyle w:val="Heading2"/>
         <w:spacing w:before="280" w:after="160"/>
       </w:pPr>
+      <w:bookmarkStart w:id="20" w:name="_Toc237764637"/>
       <w:r>
         <w:rPr>
           <w:b/>
@@ -6837,6 +8117,7 @@
         </w:rPr>
         <w:t>5.2 Main Application Flow (setup / loop)</w:t>
       </w:r>
+      <w:bookmarkEnd w:id="20"/>
     </w:p>
     <w:p>
       <w:pPr>
@@ -8179,6 +9460,7 @@
         <w:pStyle w:val="Heading2"/>
         <w:spacing w:before="280" w:after="160"/>
       </w:pPr>
+      <w:bookmarkStart w:id="21" w:name="_Toc237764638"/>
       <w:r>
         <w:rPr>
           <w:b/>
@@ -8202,6 +9484,7 @@
         </w:rPr>
         <w:t xml:space="preserve"> — Command Ingestion</w:t>
       </w:r>
+      <w:bookmarkEnd w:id="21"/>
     </w:p>
     <w:p>
       <w:pPr>
@@ -8823,6 +10106,7 @@
         <w:pStyle w:val="Heading2"/>
         <w:spacing w:before="280" w:after="160"/>
       </w:pPr>
+      <w:bookmarkStart w:id="22" w:name="_Toc237764639"/>
       <w:r>
         <w:rPr>
           <w:b/>
@@ -8846,6 +10130,7 @@
         </w:rPr>
         <w:t xml:space="preserve"> — Reconnect &amp; Failsafe</w:t>
       </w:r>
+      <w:bookmarkEnd w:id="22"/>
     </w:p>
     <w:p>
       <w:pPr>
@@ -9765,6 +11050,7 @@
         <w:pStyle w:val="Heading2"/>
         <w:spacing w:before="280" w:after="160"/>
       </w:pPr>
+      <w:bookmarkStart w:id="23" w:name="_Toc237764640"/>
       <w:r>
         <w:rPr>
           <w:b/>
@@ -9788,6 +11074,7 @@
         </w:rPr>
         <w:t xml:space="preserve"> — Failsafe Engine</w:t>
       </w:r>
+      <w:bookmarkEnd w:id="23"/>
     </w:p>
     <w:p>
       <w:pPr>
@@ -10328,6 +11615,7 @@
         <w:pStyle w:val="Heading2"/>
         <w:spacing w:before="280" w:after="160"/>
       </w:pPr>
+      <w:bookmarkStart w:id="24" w:name="_Toc237764641"/>
       <w:r>
         <w:rPr>
           <w:b/>
@@ -10351,6 +11639,7 @@
         </w:rPr>
         <w:t xml:space="preserve"> — True-State Reporter</w:t>
       </w:r>
+      <w:bookmarkEnd w:id="24"/>
     </w:p>
     <w:p>
       <w:pPr>
@@ -10928,6 +12217,7 @@
         <w:pStyle w:val="Heading1"/>
         <w:spacing w:before="360" w:after="200"/>
       </w:pPr>
+      <w:bookmarkStart w:id="25" w:name="_Toc237764642"/>
       <w:r>
         <w:rPr>
           <w:b/>
@@ -10936,6 +12226,7 @@
         <w:lastRenderedPageBreak/>
         <w:t>6. End-to-End Verification &amp; Screenshots</w:t>
       </w:r>
+      <w:bookmarkEnd w:id="25"/>
     </w:p>
     <w:p>
       <w:pPr>
@@ -11099,530 +12390,29 @@
         <w:pStyle w:val="Heading1"/>
         <w:spacing w:before="360" w:after="200"/>
       </w:pPr>
+    </w:p>
+    <w:p>
+      <w:pPr>
+        <w:pStyle w:val="Heading1"/>
+        <w:spacing w:before="360" w:after="200"/>
+      </w:pPr>
+      <w:bookmarkStart w:id="26" w:name="_Toc237764643"/>
       <w:r>
         <w:rPr>
           <w:b/>
           <w:bCs/>
         </w:rPr>
-        <w:t>7. Definition of Done</w:t>
-      </w:r>
-    </w:p>
-    <w:tbl>
-      <w:tblPr>
-        <w:tblW w:w="9600" w:type="dxa"/>
-        <w:tblBorders>
-          <w:top w:val="single" w:sz="4" w:space="0" w:color="auto"/>
-          <w:left w:val="single" w:sz="4" w:space="0" w:color="auto"/>
-          <w:bottom w:val="single" w:sz="4" w:space="0" w:color="auto"/>
-          <w:right w:val="single" w:sz="4" w:space="0" w:color="auto"/>
-          <w:insideH w:val="single" w:sz="4" w:space="0" w:color="auto"/>
-          <w:insideV w:val="single" w:sz="4" w:space="0" w:color="auto"/>
-        </w:tblBorders>
-        <w:tblCellMar>
-          <w:left w:w="10" w:type="dxa"/>
-          <w:right w:w="10" w:type="dxa"/>
-        </w:tblCellMar>
-        <w:tblLook w:val="0000" w:firstRow="0" w:lastRow="0" w:firstColumn="0" w:lastColumn="0" w:noHBand="0" w:noVBand="0"/>
-      </w:tblPr>
-      <w:tblGrid>
-        <w:gridCol w:w="5300"/>
-        <w:gridCol w:w="4300"/>
-      </w:tblGrid>
-      <w:tr>
-        <w:tblPrEx>
-          <w:tblCellMar>
-            <w:top w:w="0" w:type="dxa"/>
-            <w:bottom w:w="0" w:type="dxa"/>
-          </w:tblCellMar>
-        </w:tblPrEx>
-        <w:tc>
-          <w:tcPr>
-            <w:tcW w:w="5300" w:type="dxa"/>
-            <w:shd w:val="clear" w:color="auto" w:fill="2E74B5"/>
-            <w:tcMar>
-              <w:top w:w="80" w:type="dxa"/>
-              <w:left w:w="120" w:type="dxa"/>
-              <w:bottom w:w="80" w:type="dxa"/>
-              <w:right w:w="120" w:type="dxa"/>
-            </w:tcMar>
-            <w:vAlign w:val="center"/>
-          </w:tcPr>
-          <w:p>
-            <w:r>
-              <w:rPr>
-                <w:b/>
-                <w:bCs/>
-                <w:color w:val="FFFFFF"/>
-              </w:rPr>
-              <w:lastRenderedPageBreak/>
-              <w:t>Criterion</w:t>
-            </w:r>
-          </w:p>
-        </w:tc>
-        <w:tc>
-          <w:tcPr>
-            <w:tcW w:w="4300" w:type="dxa"/>
-            <w:shd w:val="clear" w:color="auto" w:fill="2E74B5"/>
-            <w:tcMar>
-              <w:top w:w="80" w:type="dxa"/>
-              <w:left w:w="120" w:type="dxa"/>
-              <w:bottom w:w="80" w:type="dxa"/>
-              <w:right w:w="120" w:type="dxa"/>
-            </w:tcMar>
-            <w:vAlign w:val="center"/>
-          </w:tcPr>
-          <w:p>
-            <w:r>
-              <w:rPr>
-                <w:b/>
-                <w:bCs/>
-                <w:color w:val="FFFFFF"/>
-              </w:rPr>
-              <w:t>Status</w:t>
-            </w:r>
-          </w:p>
-        </w:tc>
-      </w:tr>
-      <w:tr>
-        <w:tblPrEx>
-          <w:tblCellMar>
-            <w:top w:w="0" w:type="dxa"/>
-            <w:bottom w:w="0" w:type="dxa"/>
-          </w:tblCellMar>
-        </w:tblPrEx>
-        <w:tc>
-          <w:tcPr>
-            <w:tcW w:w="5300" w:type="dxa"/>
-            <w:shd w:val="clear" w:color="auto" w:fill="FFFFFF"/>
-            <w:tcMar>
-              <w:top w:w="70" w:type="dxa"/>
-              <w:left w:w="120" w:type="dxa"/>
-              <w:bottom w:w="70" w:type="dxa"/>
-              <w:right w:w="120" w:type="dxa"/>
-            </w:tcMar>
-            <w:vAlign w:val="center"/>
-          </w:tcPr>
-          <w:p>
-            <w:r>
-              <w:t>Broker runs from terminal with own config file, verbose output visible</w:t>
-            </w:r>
-          </w:p>
-        </w:tc>
-        <w:tc>
-          <w:tcPr>
-            <w:tcW w:w="4300" w:type="dxa"/>
-            <w:shd w:val="clear" w:color="auto" w:fill="FFFFFF"/>
-            <w:tcMar>
-              <w:top w:w="70" w:type="dxa"/>
-              <w:left w:w="120" w:type="dxa"/>
-              <w:bottom w:w="70" w:type="dxa"/>
-              <w:right w:w="120" w:type="dxa"/>
-            </w:tcMar>
-            <w:vAlign w:val="center"/>
-          </w:tcPr>
-          <w:p>
-            <w:r>
-              <w:t xml:space="preserve">Met — </w:t>
-            </w:r>
-            <w:proofErr w:type="spellStart"/>
-            <w:r>
-              <w:t>mosquitto</w:t>
-            </w:r>
-            <w:proofErr w:type="spellEnd"/>
-            <w:r>
-              <w:t xml:space="preserve"> -c </w:t>
-            </w:r>
-            <w:proofErr w:type="spellStart"/>
-            <w:r>
-              <w:t>mosquitto.conf</w:t>
-            </w:r>
-            <w:proofErr w:type="spellEnd"/>
-            <w:r>
-              <w:t xml:space="preserve"> -v</w:t>
-            </w:r>
-          </w:p>
-        </w:tc>
-      </w:tr>
-      <w:tr>
-        <w:tblPrEx>
-          <w:tblCellMar>
-            <w:top w:w="0" w:type="dxa"/>
-            <w:bottom w:w="0" w:type="dxa"/>
-          </w:tblCellMar>
-        </w:tblPrEx>
-        <w:tc>
-          <w:tcPr>
-            <w:tcW w:w="5300" w:type="dxa"/>
-            <w:shd w:val="clear" w:color="auto" w:fill="DDEBF7"/>
-            <w:tcMar>
-              <w:top w:w="70" w:type="dxa"/>
-              <w:left w:w="120" w:type="dxa"/>
-              <w:bottom w:w="70" w:type="dxa"/>
-              <w:right w:w="120" w:type="dxa"/>
-            </w:tcMar>
-            <w:vAlign w:val="center"/>
-          </w:tcPr>
-          <w:p>
-            <w:r>
-              <w:t xml:space="preserve">ESP32 </w:t>
-            </w:r>
-            <w:proofErr w:type="gramStart"/>
-            <w:r>
-              <w:t>connects over</w:t>
-            </w:r>
-            <w:proofErr w:type="gramEnd"/>
-            <w:r>
-              <w:t xml:space="preserve"> Wi-Fi to the PC's local IP and stays connected</w:t>
-            </w:r>
-          </w:p>
-        </w:tc>
-        <w:tc>
-          <w:tcPr>
-            <w:tcW w:w="4300" w:type="dxa"/>
-            <w:shd w:val="clear" w:color="auto" w:fill="DDEBF7"/>
-            <w:tcMar>
-              <w:top w:w="70" w:type="dxa"/>
-              <w:left w:w="120" w:type="dxa"/>
-              <w:bottom w:w="70" w:type="dxa"/>
-              <w:right w:w="120" w:type="dxa"/>
-            </w:tcMar>
-            <w:vAlign w:val="center"/>
-          </w:tcPr>
-          <w:p>
-            <w:r>
-              <w:t xml:space="preserve">Met — verified via </w:t>
-            </w:r>
-            <w:proofErr w:type="spellStart"/>
-            <w:r>
-              <w:t>WiFi.status</w:t>
-            </w:r>
-            <w:proofErr w:type="spellEnd"/>
-            <w:r>
-              <w:t>() and continuous telemetry</w:t>
-            </w:r>
-          </w:p>
-        </w:tc>
-      </w:tr>
-      <w:tr>
-        <w:tblPrEx>
-          <w:tblCellMar>
-            <w:top w:w="0" w:type="dxa"/>
-            <w:bottom w:w="0" w:type="dxa"/>
-          </w:tblCellMar>
-        </w:tblPrEx>
-        <w:tc>
-          <w:tcPr>
-            <w:tcW w:w="5300" w:type="dxa"/>
-            <w:shd w:val="clear" w:color="auto" w:fill="FFFFFF"/>
-            <w:tcMar>
-              <w:top w:w="70" w:type="dxa"/>
-              <w:left w:w="120" w:type="dxa"/>
-              <w:bottom w:w="70" w:type="dxa"/>
-              <w:right w:w="120" w:type="dxa"/>
-            </w:tcMar>
-            <w:vAlign w:val="center"/>
-          </w:tcPr>
-          <w:p>
-            <w:r>
-              <w:t>BME280 data publishes continuously, visible in MQTT Explorer</w:t>
-            </w:r>
-          </w:p>
-        </w:tc>
-        <w:tc>
-          <w:tcPr>
-            <w:tcW w:w="4300" w:type="dxa"/>
-            <w:shd w:val="clear" w:color="auto" w:fill="FFFFFF"/>
-            <w:tcMar>
-              <w:top w:w="70" w:type="dxa"/>
-              <w:left w:w="120" w:type="dxa"/>
-              <w:bottom w:w="70" w:type="dxa"/>
-              <w:right w:w="120" w:type="dxa"/>
-            </w:tcMar>
-            <w:vAlign w:val="center"/>
-          </w:tcPr>
-          <w:p>
-            <w:r>
-              <w:t>Met — esp32/sensor/temperature, humidity, pressure</w:t>
-            </w:r>
-          </w:p>
-        </w:tc>
-      </w:tr>
-      <w:tr>
-        <w:tblPrEx>
-          <w:tblCellMar>
-            <w:top w:w="0" w:type="dxa"/>
-            <w:bottom w:w="0" w:type="dxa"/>
-          </w:tblCellMar>
-        </w:tblPrEx>
-        <w:tc>
-          <w:tcPr>
-            <w:tcW w:w="5300" w:type="dxa"/>
-            <w:shd w:val="clear" w:color="auto" w:fill="DDEBF7"/>
-            <w:tcMar>
-              <w:top w:w="70" w:type="dxa"/>
-              <w:left w:w="120" w:type="dxa"/>
-              <w:bottom w:w="70" w:type="dxa"/>
-              <w:right w:w="120" w:type="dxa"/>
-            </w:tcMar>
-            <w:vAlign w:val="center"/>
-          </w:tcPr>
-          <w:p>
-            <w:r>
-              <w:t>ON/OFF, direction, and speed commands from MQTT Explorer control the motor</w:t>
-            </w:r>
-          </w:p>
-        </w:tc>
-        <w:tc>
-          <w:tcPr>
-            <w:tcW w:w="4300" w:type="dxa"/>
-            <w:shd w:val="clear" w:color="auto" w:fill="DDEBF7"/>
-            <w:tcMar>
-              <w:top w:w="70" w:type="dxa"/>
-              <w:left w:w="120" w:type="dxa"/>
-              <w:bottom w:w="70" w:type="dxa"/>
-              <w:right w:w="120" w:type="dxa"/>
-            </w:tcMar>
-            <w:vAlign w:val="center"/>
-          </w:tcPr>
-          <w:p>
-            <w:r>
-              <w:t xml:space="preserve">Met — routed through </w:t>
-            </w:r>
-            <w:proofErr w:type="spellStart"/>
-            <w:r>
-              <w:t>mqttCallback</w:t>
-            </w:r>
-            <w:proofErr w:type="spellEnd"/>
-            <w:r>
-              <w:t xml:space="preserve"> → </w:t>
-            </w:r>
-            <w:proofErr w:type="spellStart"/>
-            <w:r>
-              <w:t>applyMotorHardware</w:t>
-            </w:r>
-            <w:proofErr w:type="spellEnd"/>
-          </w:p>
-        </w:tc>
-      </w:tr>
-      <w:tr>
-        <w:tblPrEx>
-          <w:tblCellMar>
-            <w:top w:w="0" w:type="dxa"/>
-            <w:bottom w:w="0" w:type="dxa"/>
-          </w:tblCellMar>
-        </w:tblPrEx>
-        <w:tc>
-          <w:tcPr>
-            <w:tcW w:w="5300" w:type="dxa"/>
-            <w:shd w:val="clear" w:color="auto" w:fill="FFFFFF"/>
-            <w:tcMar>
-              <w:top w:w="70" w:type="dxa"/>
-              <w:left w:w="120" w:type="dxa"/>
-              <w:bottom w:w="70" w:type="dxa"/>
-              <w:right w:w="120" w:type="dxa"/>
-            </w:tcMar>
-            <w:vAlign w:val="center"/>
-          </w:tcPr>
-          <w:p>
-            <w:r>
-              <w:t xml:space="preserve">Motor status &amp; speed topics update live and match real motor </w:t>
-            </w:r>
-            <w:proofErr w:type="spellStart"/>
-            <w:r>
-              <w:t>behaviour</w:t>
-            </w:r>
-            <w:proofErr w:type="spellEnd"/>
-          </w:p>
-        </w:tc>
-        <w:tc>
-          <w:tcPr>
-            <w:tcW w:w="4300" w:type="dxa"/>
-            <w:shd w:val="clear" w:color="auto" w:fill="FFFFFF"/>
-            <w:tcMar>
-              <w:top w:w="70" w:type="dxa"/>
-              <w:left w:w="120" w:type="dxa"/>
-              <w:bottom w:w="70" w:type="dxa"/>
-              <w:right w:w="120" w:type="dxa"/>
-            </w:tcMar>
-            <w:vAlign w:val="center"/>
-          </w:tcPr>
-          <w:p>
-            <w:r>
-              <w:t xml:space="preserve">Met — </w:t>
-            </w:r>
-            <w:proofErr w:type="spellStart"/>
-            <w:r>
-              <w:t>publishMotorStatus</w:t>
-            </w:r>
-            <w:proofErr w:type="spellEnd"/>
-            <w:r>
-              <w:t xml:space="preserve"> reads live driver state, not last command</w:t>
-            </w:r>
-          </w:p>
-        </w:tc>
-      </w:tr>
-      <w:tr>
-        <w:tblPrEx>
-          <w:tblCellMar>
-            <w:top w:w="0" w:type="dxa"/>
-            <w:bottom w:w="0" w:type="dxa"/>
-          </w:tblCellMar>
-        </w:tblPrEx>
-        <w:tc>
-          <w:tcPr>
-            <w:tcW w:w="5300" w:type="dxa"/>
-            <w:shd w:val="clear" w:color="auto" w:fill="DDEBF7"/>
-            <w:tcMar>
-              <w:top w:w="70" w:type="dxa"/>
-              <w:left w:w="120" w:type="dxa"/>
-              <w:bottom w:w="70" w:type="dxa"/>
-              <w:right w:w="120" w:type="dxa"/>
-            </w:tcMar>
-            <w:vAlign w:val="center"/>
-          </w:tcPr>
-          <w:p>
-            <w:r>
-              <w:t>Stopping broker or cutting Wi-Fi stops motor safely; ESP32 auto-reconnects</w:t>
-            </w:r>
-          </w:p>
-        </w:tc>
-        <w:tc>
-          <w:tcPr>
-            <w:tcW w:w="4300" w:type="dxa"/>
-            <w:shd w:val="clear" w:color="auto" w:fill="DDEBF7"/>
-            <w:tcMar>
-              <w:top w:w="70" w:type="dxa"/>
-              <w:left w:w="120" w:type="dxa"/>
-              <w:bottom w:w="70" w:type="dxa"/>
-              <w:right w:w="120" w:type="dxa"/>
-            </w:tcMar>
-            <w:vAlign w:val="center"/>
-          </w:tcPr>
-          <w:p>
-            <w:r>
-              <w:t xml:space="preserve">Met — </w:t>
-            </w:r>
-            <w:proofErr w:type="spellStart"/>
-            <w:proofErr w:type="gramStart"/>
-            <w:r>
-              <w:t>ensureConnections</w:t>
-            </w:r>
-            <w:proofErr w:type="spellEnd"/>
-            <w:r>
-              <w:t>(</w:t>
-            </w:r>
-            <w:proofErr w:type="gramEnd"/>
-            <w:r>
-              <w:t xml:space="preserve">) forces </w:t>
-            </w:r>
-            <w:proofErr w:type="gramStart"/>
-            <w:r>
-              <w:t>stop(</w:t>
-            </w:r>
-            <w:proofErr w:type="gramEnd"/>
-            <w:r>
-              <w:t>) then retries non-</w:t>
-            </w:r>
-            <w:proofErr w:type="spellStart"/>
-            <w:r>
-              <w:t>blockingly</w:t>
-            </w:r>
-            <w:proofErr w:type="spellEnd"/>
-          </w:p>
-        </w:tc>
-      </w:tr>
-      <w:tr>
-        <w:tblPrEx>
-          <w:tblCellMar>
-            <w:top w:w="0" w:type="dxa"/>
-            <w:bottom w:w="0" w:type="dxa"/>
-          </w:tblCellMar>
-        </w:tblPrEx>
-        <w:tc>
-          <w:tcPr>
-            <w:tcW w:w="5300" w:type="dxa"/>
-            <w:shd w:val="clear" w:color="auto" w:fill="FFFFFF"/>
-            <w:tcMar>
-              <w:top w:w="70" w:type="dxa"/>
-              <w:left w:w="120" w:type="dxa"/>
-              <w:bottom w:w="70" w:type="dxa"/>
-              <w:right w:w="120" w:type="dxa"/>
-            </w:tcMar>
-            <w:vAlign w:val="center"/>
-          </w:tcPr>
-          <w:p>
-            <w:r>
-              <w:t>Topic structure documented in README</w:t>
-            </w:r>
-          </w:p>
-        </w:tc>
-        <w:tc>
-          <w:tcPr>
-            <w:tcW w:w="4300" w:type="dxa"/>
-            <w:shd w:val="clear" w:color="auto" w:fill="FFFFFF"/>
-            <w:tcMar>
-              <w:top w:w="70" w:type="dxa"/>
-              <w:left w:w="120" w:type="dxa"/>
-              <w:bottom w:w="70" w:type="dxa"/>
-              <w:right w:w="120" w:type="dxa"/>
-            </w:tcMar>
-            <w:vAlign w:val="center"/>
-          </w:tcPr>
-          <w:p>
-            <w:r>
-              <w:t>Documented — see Section 3 of this report</w:t>
-            </w:r>
-          </w:p>
-        </w:tc>
-      </w:tr>
-    </w:tbl>
-    <w:p/>
-    <w:p/>
-    <w:p/>
-    <w:p/>
-    <w:p/>
-    <w:p/>
-    <w:p/>
-    <w:p/>
-    <w:p/>
-    <w:p/>
-    <w:p/>
-    <w:p/>
-    <w:p/>
-    <w:p/>
-    <w:p/>
-    <w:p/>
-    <w:p/>
-    <w:p/>
-    <w:p/>
-    <w:p/>
-    <w:p/>
-    <w:p/>
-    <w:p/>
-    <w:p/>
-    <w:p/>
-    <w:p/>
-    <w:p/>
-    <w:p/>
-    <w:p/>
-    <w:p/>
-    <w:p/>
-    <w:p/>
-    <w:p/>
-    <w:p/>
-    <w:p>
-      <w:pPr>
-        <w:pStyle w:val="Heading1"/>
-        <w:spacing w:before="360" w:after="200"/>
-      </w:pPr>
+        <w:lastRenderedPageBreak/>
+        <w:t>8</w:t>
+      </w:r>
       <w:r>
         <w:rPr>
           <w:b/>
           <w:bCs/>
         </w:rPr>
-        <w:lastRenderedPageBreak/>
-        <w:t>8. References</w:t>
-      </w:r>
+        <w:t>. References</w:t>
+      </w:r>
+      <w:bookmarkEnd w:id="26"/>
     </w:p>
     <w:p>
       <w:pPr>
@@ -12567,6 +13357,7 @@
   <w:style w:type="character" w:default="1" w:styleId="DefaultParagraphFont">
     <w:name w:val="Default Paragraph Font"/>
     <w:uiPriority w:val="1"/>
+    <w:semiHidden/>
     <w:unhideWhenUsed/>
   </w:style>
   <w:style w:type="table" w:default="1" w:styleId="TableNormal">
@@ -12673,6 +13464,63 @@
       <w:sz w:val="20"/>
       <w:szCs w:val="20"/>
     </w:rPr>
+  </w:style>
+  <w:style w:type="paragraph" w:styleId="TOCHeading">
+    <w:name w:val="TOC Heading"/>
+    <w:basedOn w:val="Heading1"/>
+    <w:next w:val="Normal"/>
+    <w:uiPriority w:val="39"/>
+    <w:unhideWhenUsed/>
+    <w:qFormat/>
+    <w:rsid w:val="00386C64"/>
+    <w:pPr>
+      <w:keepNext/>
+      <w:keepLines/>
+      <w:spacing w:before="240" w:line="259" w:lineRule="auto"/>
+      <w:outlineLvl w:val="9"/>
+    </w:pPr>
+    <w:rPr>
+      <w:rFonts w:asciiTheme="majorHAnsi" w:eastAsiaTheme="majorEastAsia" w:hAnsiTheme="majorHAnsi" w:cstheme="majorBidi"/>
+      <w:color w:val="0F4761" w:themeColor="accent1" w:themeShade="BF"/>
+    </w:rPr>
+  </w:style>
+  <w:style w:type="paragraph" w:styleId="TOC1">
+    <w:name w:val="toc 1"/>
+    <w:basedOn w:val="Normal"/>
+    <w:next w:val="Normal"/>
+    <w:autoRedefine/>
+    <w:uiPriority w:val="39"/>
+    <w:unhideWhenUsed/>
+    <w:rsid w:val="00386C64"/>
+    <w:pPr>
+      <w:spacing w:after="100"/>
+    </w:pPr>
+  </w:style>
+  <w:style w:type="paragraph" w:styleId="TOC2">
+    <w:name w:val="toc 2"/>
+    <w:basedOn w:val="Normal"/>
+    <w:next w:val="Normal"/>
+    <w:autoRedefine/>
+    <w:uiPriority w:val="39"/>
+    <w:unhideWhenUsed/>
+    <w:rsid w:val="00386C64"/>
+    <w:pPr>
+      <w:spacing w:after="100"/>
+      <w:ind w:left="200"/>
+    </w:pPr>
+  </w:style>
+  <w:style w:type="paragraph" w:styleId="TOC3">
+    <w:name w:val="toc 3"/>
+    <w:basedOn w:val="Normal"/>
+    <w:next w:val="Normal"/>
+    <w:autoRedefine/>
+    <w:uiPriority w:val="39"/>
+    <w:unhideWhenUsed/>
+    <w:rsid w:val="00386C64"/>
+    <w:pPr>
+      <w:spacing w:after="100"/>
+      <w:ind w:left="400"/>
+    </w:pPr>
   </w:style>
 </w:styles>
 </file>

</xml_diff>